<commit_message>
System structure  in project report
</commit_message>
<xml_diff>
--- a/Project Report.docx
+++ b/Project Report.docx
@@ -1193,12 +1193,870 @@
     </w:p>
     <w:p>
       <w:pPr>
+        <w:pStyle w:val="Heading2"/>
+        <w:keepNext w:val="0"/>
+        <w:keepLines w:val="0"/>
+        <w:pBdr>
+          <w:top w:val="none" w:sz="0" w:space="0" w:color="1F1F1F"/>
+          <w:left w:val="none" w:sz="0" w:space="0" w:color="1F1F1F"/>
+          <w:bottom w:val="none" w:sz="0" w:space="0" w:color="1F1F1F"/>
+          <w:right w:val="none" w:sz="0" w:space="0" w:color="1F1F1F"/>
+        </w:pBdr>
+        <w:spacing w:before="0" w:after="160" w:line="23" w:lineRule="atLeast"/>
+        <w:rPr>
+          <w:rFonts w:asciiTheme="majorBidi" w:eastAsia="sans-serif" w:hAnsiTheme="majorBidi"/>
+          <w:color w:val="1F1F1F"/>
+        </w:rPr>
+      </w:pPr>
+      <w:r>
+        <w:rPr>
+          <w:rFonts w:asciiTheme="majorBidi" w:eastAsia="sans-serif" w:hAnsiTheme="majorBidi"/>
+          <w:b/>
+          <w:bCs/>
+          <w:color w:val="1F1F1F"/>
+          <w:bdr w:val="none" w:sz="0" w:space="0" w:color="1F1F1F"/>
+        </w:rPr>
+        <w:t>2. System Structure and Design Architecture</w:t>
+      </w:r>
+    </w:p>
+    <w:p>
+      <w:pPr>
+        <w:spacing w:before="100" w:beforeAutospacing="1" w:after="100" w:afterAutospacing="1" w:line="240" w:lineRule="auto"/>
+        <w:rPr>
+          <w:rFonts w:ascii="Segoe UI" w:eastAsia="Times New Roman" w:hAnsi="Segoe UI" w:cs="Segoe UI"/>
+          <w:color w:val="2B2D38"/>
+          <w:kern w:val="0"/>
+          <w:sz w:val="23"/>
+          <w:szCs w:val="23"/>
+          <w:lang w:eastAsia="en-GB"/>
+          <w14:ligatures w14:val="none"/>
+        </w:rPr>
+      </w:pPr>
+      <w:r>
+        <w:rPr>
+          <w:rFonts w:ascii="Segoe UI" w:eastAsia="Times New Roman" w:hAnsi="Segoe UI" w:cs="Segoe UI"/>
+          <w:color w:val="2B2D38"/>
+          <w:kern w:val="0"/>
+          <w:sz w:val="23"/>
+          <w:szCs w:val="23"/>
+          <w:lang w:eastAsia="en-GB"/>
+          <w14:ligatures w14:val="none"/>
+        </w:rPr>
+        <w:t>The system is made up of small parts that work together. It uses a way of programming called Object-Oriented Programming to keep things separate. This means the system has groups for each thing it does like a box, for each toy. This makes the code easy to understand and fix when something goes wrong with the system. The system follows this idea to keep everything working smoothly.</w:t>
+      </w:r>
+    </w:p>
+    <w:p>
+      <w:pPr>
+        <w:spacing w:after="0" w:line="240" w:lineRule="auto"/>
+        <w:rPr>
+          <w:rFonts w:ascii="Times New Roman" w:eastAsia="Times New Roman" w:hAnsi="Times New Roman" w:cs="Times New Roman"/>
+          <w:kern w:val="0"/>
+          <w:lang w:eastAsia="en-GB"/>
+          <w14:ligatures w14:val="none"/>
+        </w:rPr>
+      </w:pPr>
+    </w:p>
+    <w:p>
+      <w:pPr>
+        <w:pStyle w:val="Heading3"/>
+        <w:keepNext w:val="0"/>
+        <w:keepLines w:val="0"/>
+        <w:pBdr>
+          <w:top w:val="none" w:sz="0" w:space="0" w:color="1F1F1F"/>
+          <w:left w:val="none" w:sz="0" w:space="0" w:color="1F1F1F"/>
+          <w:bottom w:val="none" w:sz="0" w:space="0" w:color="1F1F1F"/>
+          <w:right w:val="none" w:sz="0" w:space="0" w:color="1F1F1F"/>
+        </w:pBdr>
+        <w:spacing w:before="0" w:after="160" w:line="23" w:lineRule="atLeast"/>
+        <w:rPr>
+          <w:rFonts w:asciiTheme="majorBidi" w:eastAsia="sans-serif" w:hAnsiTheme="majorBidi"/>
+          <w:color w:val="1F1F1F"/>
+        </w:rPr>
+      </w:pPr>
+      <w:r>
+        <w:rPr>
+          <w:rFonts w:asciiTheme="majorBidi" w:eastAsia="sans-serif" w:hAnsiTheme="majorBidi"/>
+          <w:b/>
+          <w:bCs/>
+          <w:color w:val="1F1F1F"/>
+          <w:bdr w:val="none" w:sz="0" w:space="0" w:color="1F1F1F"/>
+        </w:rPr>
+        <w:t>2.1 Member Management (</w:t>
+      </w:r>
+      <w:r>
+        <w:rPr>
+          <w:rStyle w:val="HTMLCode"/>
+          <w:rFonts w:asciiTheme="majorBidi" w:eastAsia="sans-serif" w:hAnsiTheme="majorBidi" w:cstheme="majorBidi"/>
+          <w:b/>
+          <w:bCs/>
+          <w:color w:val="444746"/>
+          <w:bdr w:val="none" w:sz="0" w:space="0" w:color="444746"/>
+        </w:rPr>
+        <w:t>Member.java</w:t>
+      </w:r>
+      <w:r>
+        <w:rPr>
+          <w:rFonts w:asciiTheme="majorBidi" w:eastAsia="sans-serif" w:hAnsiTheme="majorBidi"/>
+          <w:b/>
+          <w:bCs/>
+          <w:color w:val="1F1F1F"/>
+          <w:bdr w:val="none" w:sz="0" w:space="0" w:color="1F1F1F"/>
+        </w:rPr>
+        <w:t>)</w:t>
+      </w:r>
+    </w:p>
+    <w:p>
+      <w:pPr>
+        <w:pStyle w:val="NormalWeb"/>
+        <w:shd w:val="clear" w:color="auto" w:fill="FFFFFF"/>
+        <w:rPr>
+          <w:rFonts w:ascii="Segoe UI" w:eastAsia="Times New Roman" w:hAnsi="Segoe UI" w:cs="Segoe UI"/>
+          <w:color w:val="2B2D38"/>
+          <w:sz w:val="23"/>
+          <w:szCs w:val="23"/>
+          <w:lang w:val="en-GB" w:eastAsia="en-GB"/>
+        </w:rPr>
+      </w:pPr>
+      <w:r>
+        <w:rPr>
+          <w:rFonts w:asciiTheme="majorBidi" w:eastAsia="sans-serif" w:hAnsiTheme="majorBidi" w:cstheme="majorBidi"/>
+          <w:color w:val="1F1F1F"/>
+        </w:rPr>
+        <w:t xml:space="preserve">The </w:t>
+      </w:r>
+      <w:r>
+        <w:rPr>
+          <w:rFonts w:asciiTheme="majorBidi" w:eastAsia="sans-serif" w:hAnsiTheme="majorBidi" w:cstheme="majorBidi"/>
+          <w:color w:val="1F1F1F"/>
+        </w:rPr>
+        <w:t xml:space="preserve">Member </w:t>
+      </w:r>
+      <w:r>
+        <w:rPr>
+          <w:rFonts w:asciiTheme="majorBidi" w:eastAsia="sans-serif" w:hAnsiTheme="majorBidi" w:cstheme="majorBidi"/>
+          <w:color w:val="1F1F1F"/>
+        </w:rPr>
+        <w:t xml:space="preserve">class </w:t>
+      </w:r>
+      <w:r>
+        <w:rPr>
+          <w:rFonts w:ascii="Segoe UI" w:eastAsia="Times New Roman" w:hAnsi="Segoe UI" w:cs="Segoe UI"/>
+          <w:color w:val="2B2D38"/>
+          <w:sz w:val="23"/>
+          <w:szCs w:val="23"/>
+          <w:lang w:val="en-GB" w:eastAsia="en-GB"/>
+        </w:rPr>
+        <w:t>is the data structure, for storing user information.</w:t>
+      </w:r>
+      <w:r>
+        <w:rPr>
+          <w:rFonts w:ascii="Segoe UI" w:eastAsia="Times New Roman" w:hAnsi="Segoe UI" w:cs="Segoe UI"/>
+          <w:color w:val="2B2D38"/>
+          <w:sz w:val="23"/>
+          <w:szCs w:val="23"/>
+          <w:lang w:eastAsia="en-GB"/>
+        </w:rPr>
+        <w:t xml:space="preserve">Each member gets an ID, like M01 and a </w:t>
+      </w:r>
+      <w:proofErr w:type="spellStart"/>
+      <w:r>
+        <w:rPr>
+          <w:rFonts w:ascii="Segoe UI" w:eastAsia="Times New Roman" w:hAnsi="Segoe UI" w:cs="Segoe UI"/>
+          <w:color w:val="2B2D38"/>
+          <w:sz w:val="23"/>
+          <w:szCs w:val="23"/>
+          <w:lang w:eastAsia="en-GB"/>
+        </w:rPr>
+        <w:t>name.The</w:t>
+      </w:r>
+      <w:proofErr w:type="spellEnd"/>
+      <w:r>
+        <w:rPr>
+          <w:rFonts w:ascii="Segoe UI" w:eastAsia="Times New Roman" w:hAnsi="Segoe UI" w:cs="Segoe UI"/>
+          <w:color w:val="2B2D38"/>
+          <w:sz w:val="23"/>
+          <w:szCs w:val="23"/>
+          <w:lang w:eastAsia="en-GB"/>
+        </w:rPr>
+        <w:t xml:space="preserve"> system comes with 10 members already added for testing </w:t>
+      </w:r>
+      <w:proofErr w:type="spellStart"/>
+      <w:r>
+        <w:rPr>
+          <w:rFonts w:ascii="Segoe UI" w:eastAsia="Times New Roman" w:hAnsi="Segoe UI" w:cs="Segoe UI"/>
+          <w:color w:val="2B2D38"/>
+          <w:sz w:val="23"/>
+          <w:szCs w:val="23"/>
+          <w:lang w:eastAsia="en-GB"/>
+        </w:rPr>
+        <w:t>purposes.This</w:t>
+      </w:r>
+      <w:proofErr w:type="spellEnd"/>
+      <w:r>
+        <w:rPr>
+          <w:rFonts w:ascii="Segoe UI" w:eastAsia="Times New Roman" w:hAnsi="Segoe UI" w:cs="Segoe UI"/>
+          <w:color w:val="2B2D38"/>
+          <w:sz w:val="23"/>
+          <w:szCs w:val="23"/>
+          <w:lang w:eastAsia="en-GB"/>
+        </w:rPr>
+        <w:t xml:space="preserve"> setup allows for adding as members as needed through the available input </w:t>
+      </w:r>
+      <w:proofErr w:type="spellStart"/>
+      <w:r>
+        <w:rPr>
+          <w:rFonts w:ascii="Segoe UI" w:eastAsia="Times New Roman" w:hAnsi="Segoe UI" w:cs="Segoe UI"/>
+          <w:color w:val="2B2D38"/>
+          <w:sz w:val="23"/>
+          <w:szCs w:val="23"/>
+          <w:lang w:eastAsia="en-GB"/>
+        </w:rPr>
+        <w:t>methods.The</w:t>
+      </w:r>
+      <w:proofErr w:type="spellEnd"/>
+      <w:r>
+        <w:rPr>
+          <w:rFonts w:ascii="Segoe UI" w:eastAsia="Times New Roman" w:hAnsi="Segoe UI" w:cs="Segoe UI"/>
+          <w:color w:val="2B2D38"/>
+          <w:sz w:val="23"/>
+          <w:szCs w:val="23"/>
+          <w:lang w:eastAsia="en-GB"/>
+        </w:rPr>
+        <w:t xml:space="preserve"> Member class helps keep user data </w:t>
+      </w:r>
+      <w:proofErr w:type="spellStart"/>
+      <w:r>
+        <w:rPr>
+          <w:rFonts w:ascii="Segoe UI" w:eastAsia="Times New Roman" w:hAnsi="Segoe UI" w:cs="Segoe UI"/>
+          <w:color w:val="2B2D38"/>
+          <w:sz w:val="23"/>
+          <w:szCs w:val="23"/>
+          <w:lang w:eastAsia="en-GB"/>
+        </w:rPr>
+        <w:t>organized.It</w:t>
+      </w:r>
+      <w:proofErr w:type="spellEnd"/>
+      <w:r>
+        <w:rPr>
+          <w:rFonts w:ascii="Segoe UI" w:eastAsia="Times New Roman" w:hAnsi="Segoe UI" w:cs="Segoe UI"/>
+          <w:color w:val="2B2D38"/>
+          <w:sz w:val="23"/>
+          <w:szCs w:val="23"/>
+          <w:lang w:eastAsia="en-GB"/>
+        </w:rPr>
+        <w:t xml:space="preserve"> is designed to handle registrations.</w:t>
+      </w:r>
+    </w:p>
+    <w:p>
+      <w:pPr>
+        <w:pStyle w:val="NormalWeb"/>
+        <w:pBdr>
+          <w:top w:val="none" w:sz="0" w:space="0" w:color="1F1F1F"/>
+          <w:left w:val="none" w:sz="0" w:space="0" w:color="1F1F1F"/>
+          <w:bottom w:val="none" w:sz="0" w:space="0" w:color="1F1F1F"/>
+          <w:right w:val="none" w:sz="0" w:space="0" w:color="1F1F1F"/>
+        </w:pBdr>
+        <w:spacing w:beforeAutospacing="0" w:after="200" w:afterAutospacing="0" w:line="23" w:lineRule="atLeast"/>
+        <w:rPr>
+          <w:rFonts w:asciiTheme="majorBidi" w:eastAsia="sans-serif" w:hAnsiTheme="majorBidi"/>
+          <w:b/>
+          <w:bCs/>
+          <w:color w:val="1F1F1F"/>
+          <w:bdr w:val="none" w:sz="0" w:space="0" w:color="1F1F1F"/>
+        </w:rPr>
+      </w:pPr>
+      <w:r>
+        <w:rPr>
+          <w:rFonts w:asciiTheme="majorBidi" w:eastAsia="sans-serif" w:hAnsiTheme="majorBidi"/>
+          <w:b/>
+          <w:bCs/>
+          <w:color w:val="1F1F1F"/>
+          <w:bdr w:val="none" w:sz="0" w:space="0" w:color="1F1F1F"/>
+        </w:rPr>
+        <w:t>2.2 Lesson Definition (</w:t>
+      </w:r>
+      <w:r>
+        <w:rPr>
+          <w:rStyle w:val="HTMLCode"/>
+          <w:rFonts w:asciiTheme="majorBidi" w:eastAsia="sans-serif" w:hAnsiTheme="majorBidi" w:cstheme="majorBidi"/>
+          <w:b/>
+          <w:bCs/>
+          <w:color w:val="444746"/>
+          <w:bdr w:val="none" w:sz="0" w:space="0" w:color="444746"/>
+        </w:rPr>
+        <w:t>Lesson.java</w:t>
+      </w:r>
+      <w:r>
+        <w:rPr>
+          <w:rFonts w:asciiTheme="majorBidi" w:eastAsia="sans-serif" w:hAnsiTheme="majorBidi"/>
+          <w:b/>
+          <w:bCs/>
+          <w:color w:val="1F1F1F"/>
+          <w:bdr w:val="none" w:sz="0" w:space="0" w:color="1F1F1F"/>
+        </w:rPr>
+        <w:t>)</w:t>
+      </w:r>
+    </w:p>
+    <w:p>
+      <w:pPr>
+        <w:rPr>
+          <w:rFonts w:asciiTheme="majorBidi" w:hAnsiTheme="majorBidi" w:cstheme="majorBidi"/>
+        </w:rPr>
+      </w:pPr>
+      <w:r>
+        <w:rPr>
+          <w:rFonts w:asciiTheme="majorBidi" w:hAnsiTheme="majorBidi" w:cstheme="majorBidi"/>
+        </w:rPr>
+        <w:t xml:space="preserve">The </w:t>
+      </w:r>
+      <w:r>
+        <w:rPr>
+          <w:rFonts w:asciiTheme="majorBidi" w:hAnsiTheme="majorBidi" w:cstheme="majorBidi"/>
+          <w:sz w:val="20"/>
+          <w:szCs w:val="20"/>
+        </w:rPr>
+        <w:t>Lesson</w:t>
+      </w:r>
+      <w:r>
+        <w:rPr>
+          <w:rFonts w:asciiTheme="majorBidi" w:hAnsiTheme="majorBidi" w:cstheme="majorBidi"/>
+        </w:rPr>
+        <w:t xml:space="preserve"> class represents the specific exercise sessions available at the </w:t>
+      </w:r>
+      <w:proofErr w:type="spellStart"/>
+      <w:r>
+        <w:rPr>
+          <w:rFonts w:asciiTheme="majorBidi" w:hAnsiTheme="majorBidi" w:cstheme="majorBidi"/>
+        </w:rPr>
+        <w:t>center</w:t>
+      </w:r>
+      <w:proofErr w:type="spellEnd"/>
+      <w:r>
+        <w:rPr>
+          <w:rFonts w:asciiTheme="majorBidi" w:hAnsiTheme="majorBidi" w:cstheme="majorBidi"/>
+        </w:rPr>
+        <w:t>. It holds five key attributes:</w:t>
+      </w:r>
+    </w:p>
+    <w:p>
+      <w:pPr>
+        <w:pStyle w:val="ListParagraph"/>
+        <w:numPr>
+          <w:ilvl w:val="0"/>
+          <w:numId w:val="10"/>
+        </w:numPr>
+        <w:spacing w:before="100" w:beforeAutospacing="1" w:after="100" w:afterAutospacing="1" w:line="240" w:lineRule="auto"/>
+        <w:rPr>
+          <w:rFonts w:asciiTheme="majorBidi" w:eastAsia="Times New Roman" w:hAnsiTheme="majorBidi" w:cstheme="majorBidi"/>
+          <w:kern w:val="0"/>
+          <w:lang w:eastAsia="en-GB"/>
+          <w14:ligatures w14:val="none"/>
+        </w:rPr>
+      </w:pPr>
+      <w:r>
+        <w:rPr>
+          <w:rFonts w:asciiTheme="majorBidi" w:eastAsia="Times New Roman" w:hAnsiTheme="majorBidi" w:cstheme="majorBidi"/>
+          <w:b/>
+          <w:bCs/>
+          <w:kern w:val="0"/>
+          <w:lang w:eastAsia="en-GB"/>
+          <w14:ligatures w14:val="none"/>
+        </w:rPr>
+        <w:t>Lesson ID</w:t>
+      </w:r>
+      <w:r>
+        <w:rPr>
+          <w:rFonts w:asciiTheme="majorBidi" w:eastAsia="Times New Roman" w:hAnsiTheme="majorBidi" w:cstheme="majorBidi"/>
+          <w:kern w:val="0"/>
+          <w:lang w:eastAsia="en-GB"/>
+          <w14:ligatures w14:val="none"/>
+        </w:rPr>
+        <w:t>: A unique string identifying the week, day, and time.</w:t>
+      </w:r>
+    </w:p>
+    <w:p>
+      <w:pPr>
+        <w:pStyle w:val="ListParagraph"/>
+        <w:numPr>
+          <w:ilvl w:val="0"/>
+          <w:numId w:val="10"/>
+        </w:numPr>
+        <w:spacing w:before="100" w:beforeAutospacing="1" w:after="100" w:afterAutospacing="1" w:line="240" w:lineRule="auto"/>
+        <w:rPr>
+          <w:rFonts w:asciiTheme="majorBidi" w:eastAsia="Times New Roman" w:hAnsiTheme="majorBidi" w:cstheme="majorBidi"/>
+          <w:kern w:val="0"/>
+          <w:lang w:eastAsia="en-GB"/>
+          <w14:ligatures w14:val="none"/>
+        </w:rPr>
+      </w:pPr>
+      <w:r>
+        <w:rPr>
+          <w:rFonts w:asciiTheme="majorBidi" w:eastAsia="Times New Roman" w:hAnsiTheme="majorBidi" w:cstheme="majorBidi"/>
+          <w:b/>
+          <w:bCs/>
+          <w:kern w:val="0"/>
+          <w:lang w:eastAsia="en-GB"/>
+          <w14:ligatures w14:val="none"/>
+        </w:rPr>
+        <w:t>Type</w:t>
+      </w:r>
+      <w:r>
+        <w:rPr>
+          <w:rFonts w:asciiTheme="majorBidi" w:eastAsia="Times New Roman" w:hAnsiTheme="majorBidi" w:cstheme="majorBidi"/>
+          <w:kern w:val="0"/>
+          <w:lang w:eastAsia="en-GB"/>
+          <w14:ligatures w14:val="none"/>
+        </w:rPr>
+        <w:t>: The exercise category (Yoga, Zumba, Aquacise, Box Fit).</w:t>
+      </w:r>
+    </w:p>
+    <w:p>
+      <w:pPr>
+        <w:pStyle w:val="ListParagraph"/>
+        <w:numPr>
+          <w:ilvl w:val="0"/>
+          <w:numId w:val="10"/>
+        </w:numPr>
+        <w:spacing w:before="100" w:beforeAutospacing="1" w:after="100" w:afterAutospacing="1" w:line="240" w:lineRule="auto"/>
+        <w:rPr>
+          <w:rFonts w:asciiTheme="majorBidi" w:eastAsia="Times New Roman" w:hAnsiTheme="majorBidi" w:cstheme="majorBidi"/>
+          <w:kern w:val="0"/>
+          <w:lang w:eastAsia="en-GB"/>
+          <w14:ligatures w14:val="none"/>
+        </w:rPr>
+      </w:pPr>
+      <w:r>
+        <w:rPr>
+          <w:rFonts w:asciiTheme="majorBidi" w:eastAsia="Times New Roman" w:hAnsiTheme="majorBidi" w:cstheme="majorBidi"/>
+          <w:b/>
+          <w:bCs/>
+          <w:kern w:val="0"/>
+          <w:lang w:eastAsia="en-GB"/>
+          <w14:ligatures w14:val="none"/>
+        </w:rPr>
+        <w:t>Schedule</w:t>
+      </w:r>
+      <w:r>
+        <w:rPr>
+          <w:rFonts w:asciiTheme="majorBidi" w:eastAsia="Times New Roman" w:hAnsiTheme="majorBidi" w:cstheme="majorBidi"/>
+          <w:kern w:val="0"/>
+          <w:lang w:eastAsia="en-GB"/>
+          <w14:ligatures w14:val="none"/>
+        </w:rPr>
+        <w:t>: The specific day (Saturday/Sunday) and time slot (Morning, Afternoon, Evening).</w:t>
+      </w:r>
+    </w:p>
+    <w:p>
+      <w:pPr>
+        <w:pStyle w:val="ListParagraph"/>
+        <w:numPr>
+          <w:ilvl w:val="0"/>
+          <w:numId w:val="10"/>
+        </w:numPr>
+        <w:spacing w:before="100" w:beforeAutospacing="1" w:after="100" w:afterAutospacing="1" w:line="240" w:lineRule="auto"/>
+        <w:rPr>
+          <w:rFonts w:asciiTheme="majorBidi" w:eastAsia="Times New Roman" w:hAnsiTheme="majorBidi" w:cstheme="majorBidi"/>
+          <w:kern w:val="0"/>
+          <w:lang w:eastAsia="en-GB"/>
+          <w14:ligatures w14:val="none"/>
+        </w:rPr>
+      </w:pPr>
+      <w:r>
+        <w:rPr>
+          <w:rFonts w:asciiTheme="majorBidi" w:eastAsia="Times New Roman" w:hAnsiTheme="majorBidi" w:cstheme="majorBidi"/>
+          <w:b/>
+          <w:bCs/>
+          <w:kern w:val="0"/>
+          <w:lang w:eastAsia="en-GB"/>
+          <w14:ligatures w14:val="none"/>
+        </w:rPr>
+        <w:t>Pricing</w:t>
+      </w:r>
+      <w:r>
+        <w:rPr>
+          <w:rFonts w:asciiTheme="majorBidi" w:eastAsia="Times New Roman" w:hAnsiTheme="majorBidi" w:cstheme="majorBidi"/>
+          <w:kern w:val="0"/>
+          <w:lang w:eastAsia="en-GB"/>
+          <w14:ligatures w14:val="none"/>
+        </w:rPr>
+        <w:t>: A fixed cost associated with the exercise type.</w:t>
+      </w:r>
+    </w:p>
+    <w:p>
+      <w:pPr>
+        <w:pStyle w:val="ListParagraph"/>
+        <w:numPr>
+          <w:ilvl w:val="0"/>
+          <w:numId w:val="10"/>
+        </w:numPr>
+        <w:spacing w:before="100" w:beforeAutospacing="1" w:after="100" w:afterAutospacing="1" w:line="240" w:lineRule="auto"/>
+        <w:rPr>
+          <w:rFonts w:asciiTheme="majorBidi" w:eastAsia="Times New Roman" w:hAnsiTheme="majorBidi" w:cstheme="majorBidi"/>
+          <w:kern w:val="0"/>
+          <w:lang w:eastAsia="en-GB"/>
+          <w14:ligatures w14:val="none"/>
+        </w:rPr>
+      </w:pPr>
+      <w:r>
+        <w:rPr>
+          <w:rFonts w:asciiTheme="majorBidi" w:eastAsia="Times New Roman" w:hAnsiTheme="majorBidi" w:cstheme="majorBidi"/>
+          <w:b/>
+          <w:bCs/>
+          <w:kern w:val="0"/>
+          <w:lang w:eastAsia="en-GB"/>
+          <w14:ligatures w14:val="none"/>
+        </w:rPr>
+        <w:t>Capacity</w:t>
+      </w:r>
+      <w:r>
+        <w:rPr>
+          <w:rFonts w:asciiTheme="majorBidi" w:eastAsia="Times New Roman" w:hAnsiTheme="majorBidi" w:cstheme="majorBidi"/>
+          <w:kern w:val="0"/>
+          <w:lang w:eastAsia="en-GB"/>
+          <w14:ligatures w14:val="none"/>
+        </w:rPr>
+        <w:t>: An integer limit (set to 4) to ensure safety and quality of instruction.</w:t>
+      </w:r>
+    </w:p>
+    <w:p>
+      <w:pPr>
+        <w:numPr>
+          <w:ilvl w:val="0"/>
+          <w:numId w:val="1"/>
+        </w:numPr>
+        <w:pBdr>
+          <w:top w:val="none" w:sz="0" w:space="0" w:color="1F1F1F"/>
+          <w:left w:val="none" w:sz="0" w:space="0" w:color="1F1F1F"/>
+          <w:bottom w:val="none" w:sz="0" w:space="0" w:color="1F1F1F"/>
+          <w:right w:val="none" w:sz="0" w:space="0" w:color="1F1F1F"/>
+        </w:pBdr>
         <w:spacing w:line="23" w:lineRule="atLeast"/>
+        <w:ind w:left="0"/>
+        <w:rPr>
+          <w:rFonts w:asciiTheme="majorBidi" w:eastAsia="sans-serif" w:hAnsiTheme="majorBidi" w:cstheme="majorBidi"/>
+          <w:color w:val="1F1F1F"/>
+        </w:rPr>
+      </w:pPr>
+    </w:p>
+    <w:p>
+      <w:pPr>
+        <w:pStyle w:val="Heading3"/>
+        <w:keepNext w:val="0"/>
+        <w:keepLines w:val="0"/>
+        <w:pBdr>
+          <w:top w:val="none" w:sz="0" w:space="0" w:color="1F1F1F"/>
+          <w:left w:val="none" w:sz="0" w:space="0" w:color="1F1F1F"/>
+          <w:bottom w:val="none" w:sz="0" w:space="0" w:color="1F1F1F"/>
+          <w:right w:val="none" w:sz="0" w:space="0" w:color="1F1F1F"/>
+        </w:pBdr>
+        <w:spacing w:before="0" w:after="160" w:line="23" w:lineRule="atLeast"/>
+        <w:rPr>
+          <w:rFonts w:asciiTheme="majorBidi" w:eastAsia="sans-serif" w:hAnsiTheme="majorBidi"/>
+          <w:color w:val="1F1F1F"/>
+        </w:rPr>
+      </w:pPr>
+      <w:r>
+        <w:rPr>
+          <w:rFonts w:asciiTheme="majorBidi" w:eastAsia="sans-serif" w:hAnsiTheme="majorBidi"/>
+          <w:b/>
+          <w:bCs/>
+          <w:color w:val="1F1F1F"/>
+          <w:bdr w:val="none" w:sz="0" w:space="0" w:color="1F1F1F"/>
+        </w:rPr>
+        <w:t>2.3 The Booking Lifecycle (</w:t>
+      </w:r>
+      <w:r>
+        <w:rPr>
+          <w:rStyle w:val="HTMLCode"/>
+          <w:rFonts w:asciiTheme="majorBidi" w:eastAsia="sans-serif" w:hAnsiTheme="majorBidi" w:cstheme="majorBidi"/>
+          <w:b/>
+          <w:bCs/>
+          <w:color w:val="444746"/>
+          <w:bdr w:val="none" w:sz="0" w:space="0" w:color="444746"/>
+        </w:rPr>
+        <w:t>Booking.java</w:t>
+      </w:r>
+      <w:r>
+        <w:rPr>
+          <w:rFonts w:asciiTheme="majorBidi" w:eastAsia="sans-serif" w:hAnsiTheme="majorBidi"/>
+          <w:b/>
+          <w:bCs/>
+          <w:color w:val="1F1F1F"/>
+          <w:bdr w:val="none" w:sz="0" w:space="0" w:color="1F1F1F"/>
+        </w:rPr>
+        <w:t>)</w:t>
+      </w:r>
+    </w:p>
+    <w:p>
+      <w:pPr>
+        <w:shd w:val="clear" w:color="auto" w:fill="FFFFFF"/>
+        <w:spacing w:before="100" w:beforeAutospacing="1" w:after="100" w:afterAutospacing="1" w:line="240" w:lineRule="auto"/>
+        <w:rPr>
+          <w:rFonts w:ascii="Segoe UI" w:eastAsia="Times New Roman" w:hAnsi="Segoe UI" w:cs="Segoe UI"/>
+          <w:color w:val="2B2D38"/>
+          <w:kern w:val="0"/>
+          <w:sz w:val="23"/>
+          <w:szCs w:val="23"/>
+          <w:lang w:eastAsia="en-GB"/>
+          <w14:ligatures w14:val="none"/>
+        </w:rPr>
+      </w:pPr>
+      <w:r>
+        <w:rPr>
+          <w:rFonts w:ascii="Segoe UI" w:eastAsia="Times New Roman" w:hAnsi="Segoe UI" w:cs="Segoe UI"/>
+          <w:color w:val="2B2D38"/>
+          <w:kern w:val="0"/>
+          <w:sz w:val="23"/>
+          <w:szCs w:val="23"/>
+          <w:lang w:eastAsia="en-GB"/>
+          <w14:ligatures w14:val="none"/>
+        </w:rPr>
+        <w:t>The Booking class is like a diary that keeps track of what happens between a member and a lesson. It is not a simple list the Booking class also keeps an eye on how things are going with the booking. A Booking can go through different stages, such as</w:t>
+      </w:r>
+    </w:p>
+    <w:p>
+      <w:pPr>
+        <w:pStyle w:val="ListParagraph"/>
+        <w:numPr>
+          <w:ilvl w:val="0"/>
+          <w:numId w:val="21"/>
+        </w:numPr>
+        <w:shd w:val="clear" w:color="auto" w:fill="FFFFFF"/>
+        <w:spacing w:before="150" w:after="100" w:afterAutospacing="1" w:line="240" w:lineRule="auto"/>
+        <w:rPr>
+          <w:rFonts w:ascii="Segoe UI" w:eastAsia="Times New Roman" w:hAnsi="Segoe UI" w:cs="Segoe UI"/>
+          <w:color w:val="2B2D38"/>
+          <w:kern w:val="0"/>
+          <w:sz w:val="23"/>
+          <w:szCs w:val="23"/>
+          <w:lang w:eastAsia="en-GB"/>
+          <w14:ligatures w14:val="none"/>
+        </w:rPr>
+      </w:pPr>
+      <w:r>
+        <w:rPr>
+          <w:rFonts w:ascii="Segoe UI" w:eastAsia="Times New Roman" w:hAnsi="Segoe UI" w:cs="Segoe UI"/>
+          <w:b/>
+          <w:bCs/>
+          <w:color w:val="2B2D38"/>
+          <w:kern w:val="0"/>
+          <w:sz w:val="23"/>
+          <w:szCs w:val="23"/>
+          <w:lang w:eastAsia="en-GB"/>
+          <w14:ligatures w14:val="none"/>
+        </w:rPr>
+        <w:lastRenderedPageBreak/>
+        <w:t>Booked</w:t>
+      </w:r>
+      <w:r>
+        <w:rPr>
+          <w:rFonts w:ascii="Segoe UI" w:eastAsia="Times New Roman" w:hAnsi="Segoe UI" w:cs="Segoe UI"/>
+          <w:color w:val="2B2D38"/>
+          <w:kern w:val="0"/>
+          <w:sz w:val="23"/>
+          <w:szCs w:val="23"/>
+          <w:lang w:eastAsia="en-GB"/>
+          <w14:ligatures w14:val="none"/>
+        </w:rPr>
+        <w:t>: this is the first stage when someone books a spot.</w:t>
+      </w:r>
+    </w:p>
+    <w:p>
+      <w:pPr>
+        <w:pStyle w:val="ListParagraph"/>
+        <w:numPr>
+          <w:ilvl w:val="0"/>
+          <w:numId w:val="21"/>
+        </w:numPr>
+        <w:shd w:val="clear" w:color="auto" w:fill="FFFFFF"/>
+        <w:spacing w:before="150" w:after="100" w:afterAutospacing="1" w:line="240" w:lineRule="auto"/>
+        <w:rPr>
+          <w:rFonts w:ascii="Segoe UI" w:eastAsia="Times New Roman" w:hAnsi="Segoe UI" w:cs="Segoe UI"/>
+          <w:color w:val="2B2D38"/>
+          <w:kern w:val="0"/>
+          <w:sz w:val="23"/>
+          <w:szCs w:val="23"/>
+          <w:lang w:eastAsia="en-GB"/>
+          <w14:ligatures w14:val="none"/>
+        </w:rPr>
+      </w:pPr>
+      <w:r>
+        <w:rPr>
+          <w:rFonts w:ascii="Segoe UI" w:eastAsia="Times New Roman" w:hAnsi="Segoe UI" w:cs="Segoe UI"/>
+          <w:b/>
+          <w:bCs/>
+          <w:color w:val="2B2D38"/>
+          <w:kern w:val="0"/>
+          <w:sz w:val="23"/>
+          <w:szCs w:val="23"/>
+          <w:lang w:eastAsia="en-GB"/>
+          <w14:ligatures w14:val="none"/>
+        </w:rPr>
+        <w:t>Attended</w:t>
+      </w:r>
+      <w:r>
+        <w:rPr>
+          <w:rFonts w:ascii="Segoe UI" w:eastAsia="Times New Roman" w:hAnsi="Segoe UI" w:cs="Segoe UI"/>
+          <w:color w:val="2B2D38"/>
+          <w:kern w:val="0"/>
+          <w:sz w:val="23"/>
+          <w:szCs w:val="23"/>
+          <w:lang w:eastAsia="en-GB"/>
+          <w14:ligatures w14:val="none"/>
+        </w:rPr>
+        <w:t>: this is the stage when the member has finished the lesson.</w:t>
+      </w:r>
+    </w:p>
+    <w:p>
+      <w:pPr>
+        <w:pStyle w:val="ListParagraph"/>
+        <w:numPr>
+          <w:ilvl w:val="0"/>
+          <w:numId w:val="21"/>
+        </w:numPr>
+        <w:shd w:val="clear" w:color="auto" w:fill="FFFFFF"/>
+        <w:spacing w:before="150" w:after="100" w:afterAutospacing="1" w:line="240" w:lineRule="auto"/>
+        <w:rPr>
+          <w:rFonts w:ascii="Segoe UI" w:eastAsia="Times New Roman" w:hAnsi="Segoe UI" w:cs="Segoe UI"/>
+          <w:color w:val="2B2D38"/>
+          <w:kern w:val="0"/>
+          <w:sz w:val="23"/>
+          <w:szCs w:val="23"/>
+          <w:lang w:eastAsia="en-GB"/>
+          <w14:ligatures w14:val="none"/>
+        </w:rPr>
+      </w:pPr>
+      <w:r>
+        <w:rPr>
+          <w:rFonts w:ascii="Segoe UI" w:eastAsia="Times New Roman" w:hAnsi="Segoe UI" w:cs="Segoe UI"/>
+          <w:b/>
+          <w:bCs/>
+          <w:color w:val="2B2D38"/>
+          <w:kern w:val="0"/>
+          <w:sz w:val="23"/>
+          <w:szCs w:val="23"/>
+          <w:lang w:eastAsia="en-GB"/>
+          <w14:ligatures w14:val="none"/>
+        </w:rPr>
+        <w:t>Cancelled or Changed</w:t>
+      </w:r>
+      <w:r>
+        <w:rPr>
+          <w:rFonts w:ascii="Segoe UI" w:eastAsia="Times New Roman" w:hAnsi="Segoe UI" w:cs="Segoe UI"/>
+          <w:color w:val="2B2D38"/>
+          <w:kern w:val="0"/>
+          <w:sz w:val="23"/>
+          <w:szCs w:val="23"/>
+          <w:lang w:eastAsia="en-GB"/>
+          <w14:ligatures w14:val="none"/>
+        </w:rPr>
+        <w:t>: these are stages that mean the spot is available again because the member is not going to use it. The Booking class is useful, for keeping track of all these stages of a Booking.</w:t>
+      </w:r>
+    </w:p>
+    <w:p>
+      <w:pPr>
+        <w:pBdr>
+          <w:top w:val="none" w:sz="0" w:space="0" w:color="1F1F1F"/>
+          <w:left w:val="none" w:sz="0" w:space="0" w:color="1F1F1F"/>
+          <w:bottom w:val="none" w:sz="0" w:space="0" w:color="1F1F1F"/>
+          <w:right w:val="none" w:sz="0" w:space="0" w:color="1F1F1F"/>
+        </w:pBdr>
+        <w:spacing w:line="23" w:lineRule="atLeast"/>
+        <w:rPr>
+          <w:rFonts w:asciiTheme="majorBidi" w:eastAsia="sans-serif" w:hAnsiTheme="majorBidi" w:cstheme="majorBidi"/>
+          <w:color w:val="1F1F1F"/>
+        </w:rPr>
+      </w:pPr>
+    </w:p>
+    <w:p>
+      <w:pPr>
+        <w:pStyle w:val="Heading3"/>
+        <w:keepNext w:val="0"/>
+        <w:keepLines w:val="0"/>
+        <w:pBdr>
+          <w:top w:val="none" w:sz="0" w:space="0" w:color="1F1F1F"/>
+          <w:left w:val="none" w:sz="0" w:space="0" w:color="1F1F1F"/>
+          <w:bottom w:val="none" w:sz="0" w:space="0" w:color="1F1F1F"/>
+          <w:right w:val="none" w:sz="0" w:space="0" w:color="1F1F1F"/>
+        </w:pBdr>
+        <w:spacing w:before="0" w:after="160" w:line="23" w:lineRule="atLeast"/>
+        <w:rPr>
+          <w:rFonts w:asciiTheme="majorBidi" w:eastAsia="sans-serif" w:hAnsiTheme="majorBidi"/>
+          <w:color w:val="1F1F1F"/>
+        </w:rPr>
+      </w:pPr>
+      <w:r>
+        <w:rPr>
+          <w:rFonts w:asciiTheme="majorBidi" w:eastAsia="sans-serif" w:hAnsiTheme="majorBidi"/>
+          <w:b/>
+          <w:bCs/>
+          <w:color w:val="1F1F1F"/>
+          <w:bdr w:val="none" w:sz="0" w:space="0" w:color="1F1F1F"/>
+        </w:rPr>
+        <w:t>2.4 Review and Feedback (</w:t>
+      </w:r>
+      <w:r>
+        <w:rPr>
+          <w:rStyle w:val="HTMLCode"/>
+          <w:rFonts w:asciiTheme="majorBidi" w:eastAsia="sans-serif" w:hAnsiTheme="majorBidi" w:cstheme="majorBidi"/>
+          <w:b/>
+          <w:bCs/>
+          <w:color w:val="444746"/>
+          <w:bdr w:val="none" w:sz="0" w:space="0" w:color="444746"/>
+        </w:rPr>
+        <w:t>Review.java</w:t>
+      </w:r>
+      <w:r>
+        <w:rPr>
+          <w:rFonts w:asciiTheme="majorBidi" w:eastAsia="sans-serif" w:hAnsiTheme="majorBidi"/>
+          <w:b/>
+          <w:bCs/>
+          <w:color w:val="1F1F1F"/>
+          <w:bdr w:val="none" w:sz="0" w:space="0" w:color="1F1F1F"/>
+        </w:rPr>
+        <w:t>)</w:t>
+      </w:r>
+    </w:p>
+    <w:p>
+      <w:pPr>
+        <w:spacing w:line="23" w:lineRule="atLeast"/>
         <w:rPr>
           <w:rFonts w:asciiTheme="majorBidi" w:eastAsia="sans-serif" w:hAnsiTheme="majorBidi" w:cstheme="majorBidi"/>
           <w:color w:val="808080"/>
         </w:rPr>
       </w:pPr>
+      <w:r>
+        <w:rPr>
+          <w:rFonts w:ascii="Segoe UI" w:hAnsi="Segoe UI" w:cs="Segoe UI"/>
+          <w:color w:val="2B2D38"/>
+          <w:sz w:val="23"/>
+          <w:szCs w:val="23"/>
+          <w:shd w:val="clear" w:color="auto" w:fill="FFFFFF"/>
+        </w:rPr>
+        <w:t xml:space="preserve">When the status is updated to "Attended" the system starts the Review class. The Review class is where we store a rating from 1 to 5 and a comment that describes something. There is a method, in the Review class that checks everything to make sure we do not get any ratings like 0 or 6 in the systems reporting engine. The Review class </w:t>
+      </w:r>
+      <w:proofErr w:type="gramStart"/>
+      <w:r>
+        <w:rPr>
+          <w:rFonts w:ascii="Segoe UI" w:hAnsi="Segoe UI" w:cs="Segoe UI"/>
+          <w:color w:val="2B2D38"/>
+          <w:sz w:val="23"/>
+          <w:szCs w:val="23"/>
+          <w:shd w:val="clear" w:color="auto" w:fill="FFFFFF"/>
+        </w:rPr>
+        <w:t>has to</w:t>
+      </w:r>
+      <w:proofErr w:type="gramEnd"/>
+      <w:r>
+        <w:rPr>
+          <w:rFonts w:ascii="Segoe UI" w:hAnsi="Segoe UI" w:cs="Segoe UI"/>
+          <w:color w:val="2B2D38"/>
+          <w:sz w:val="23"/>
+          <w:szCs w:val="23"/>
+          <w:shd w:val="clear" w:color="auto" w:fill="FFFFFF"/>
+        </w:rPr>
+        <w:t xml:space="preserve"> make sure these bad ratings do not get in</w:t>
+      </w:r>
     </w:p>
     <w:p>
       <w:pPr>
@@ -2766,6 +3624,119 @@
     </w:lvl>
   </w:abstractNum>
   <w:abstractNum w:abstractNumId="11" w15:restartNumberingAfterBreak="0">
+    <w:nsid w:val="3DAA682F"/>
+    <w:multiLevelType w:val="hybridMultilevel"/>
+    <w:tmpl w:val="2FD4653A"/>
+    <w:lvl w:ilvl="0" w:tplc="08090001">
+      <w:start w:val="1"/>
+      <w:numFmt w:val="bullet"/>
+      <w:lvlText w:val=""/>
+      <w:lvlJc w:val="left"/>
+      <w:pPr>
+        <w:ind w:left="720" w:hanging="360"/>
+      </w:pPr>
+      <w:rPr>
+        <w:rFonts w:ascii="Symbol" w:hAnsi="Symbol" w:hint="default"/>
+      </w:rPr>
+    </w:lvl>
+    <w:lvl w:ilvl="1" w:tplc="08090003" w:tentative="1">
+      <w:start w:val="1"/>
+      <w:numFmt w:val="bullet"/>
+      <w:lvlText w:val="o"/>
+      <w:lvlJc w:val="left"/>
+      <w:pPr>
+        <w:ind w:left="1440" w:hanging="360"/>
+      </w:pPr>
+      <w:rPr>
+        <w:rFonts w:ascii="Courier New" w:hAnsi="Courier New" w:cs="Courier New" w:hint="default"/>
+      </w:rPr>
+    </w:lvl>
+    <w:lvl w:ilvl="2" w:tplc="08090005" w:tentative="1">
+      <w:start w:val="1"/>
+      <w:numFmt w:val="bullet"/>
+      <w:lvlText w:val=""/>
+      <w:lvlJc w:val="left"/>
+      <w:pPr>
+        <w:ind w:left="2160" w:hanging="360"/>
+      </w:pPr>
+      <w:rPr>
+        <w:rFonts w:ascii="Wingdings" w:hAnsi="Wingdings" w:hint="default"/>
+      </w:rPr>
+    </w:lvl>
+    <w:lvl w:ilvl="3" w:tplc="08090001" w:tentative="1">
+      <w:start w:val="1"/>
+      <w:numFmt w:val="bullet"/>
+      <w:lvlText w:val=""/>
+      <w:lvlJc w:val="left"/>
+      <w:pPr>
+        <w:ind w:left="2880" w:hanging="360"/>
+      </w:pPr>
+      <w:rPr>
+        <w:rFonts w:ascii="Symbol" w:hAnsi="Symbol" w:hint="default"/>
+      </w:rPr>
+    </w:lvl>
+    <w:lvl w:ilvl="4" w:tplc="08090003" w:tentative="1">
+      <w:start w:val="1"/>
+      <w:numFmt w:val="bullet"/>
+      <w:lvlText w:val="o"/>
+      <w:lvlJc w:val="left"/>
+      <w:pPr>
+        <w:ind w:left="3600" w:hanging="360"/>
+      </w:pPr>
+      <w:rPr>
+        <w:rFonts w:ascii="Courier New" w:hAnsi="Courier New" w:cs="Courier New" w:hint="default"/>
+      </w:rPr>
+    </w:lvl>
+    <w:lvl w:ilvl="5" w:tplc="08090005" w:tentative="1">
+      <w:start w:val="1"/>
+      <w:numFmt w:val="bullet"/>
+      <w:lvlText w:val=""/>
+      <w:lvlJc w:val="left"/>
+      <w:pPr>
+        <w:ind w:left="4320" w:hanging="360"/>
+      </w:pPr>
+      <w:rPr>
+        <w:rFonts w:ascii="Wingdings" w:hAnsi="Wingdings" w:hint="default"/>
+      </w:rPr>
+    </w:lvl>
+    <w:lvl w:ilvl="6" w:tplc="08090001" w:tentative="1">
+      <w:start w:val="1"/>
+      <w:numFmt w:val="bullet"/>
+      <w:lvlText w:val=""/>
+      <w:lvlJc w:val="left"/>
+      <w:pPr>
+        <w:ind w:left="5040" w:hanging="360"/>
+      </w:pPr>
+      <w:rPr>
+        <w:rFonts w:ascii="Symbol" w:hAnsi="Symbol" w:hint="default"/>
+      </w:rPr>
+    </w:lvl>
+    <w:lvl w:ilvl="7" w:tplc="08090003" w:tentative="1">
+      <w:start w:val="1"/>
+      <w:numFmt w:val="bullet"/>
+      <w:lvlText w:val="o"/>
+      <w:lvlJc w:val="left"/>
+      <w:pPr>
+        <w:ind w:left="5760" w:hanging="360"/>
+      </w:pPr>
+      <w:rPr>
+        <w:rFonts w:ascii="Courier New" w:hAnsi="Courier New" w:cs="Courier New" w:hint="default"/>
+      </w:rPr>
+    </w:lvl>
+    <w:lvl w:ilvl="8" w:tplc="08090005" w:tentative="1">
+      <w:start w:val="1"/>
+      <w:numFmt w:val="bullet"/>
+      <w:lvlText w:val=""/>
+      <w:lvlJc w:val="left"/>
+      <w:pPr>
+        <w:ind w:left="6480" w:hanging="360"/>
+      </w:pPr>
+      <w:rPr>
+        <w:rFonts w:ascii="Wingdings" w:hAnsi="Wingdings" w:hint="default"/>
+      </w:rPr>
+    </w:lvl>
+  </w:abstractNum>
+  <w:abstractNum w:abstractNumId="12" w15:restartNumberingAfterBreak="0">
     <w:nsid w:val="42101451"/>
     <w:multiLevelType w:val="hybridMultilevel"/>
     <w:tmpl w:val="1F4A9E2A"/>
@@ -2878,7 +3849,7 @@
       </w:rPr>
     </w:lvl>
   </w:abstractNum>
-  <w:abstractNum w:abstractNumId="12" w15:restartNumberingAfterBreak="0">
+  <w:abstractNum w:abstractNumId="13" w15:restartNumberingAfterBreak="0">
     <w:nsid w:val="5C1C71AA"/>
     <w:multiLevelType w:val="hybridMultilevel"/>
     <w:tmpl w:val="B396FF86"/>
@@ -2991,7 +3962,7 @@
       </w:rPr>
     </w:lvl>
   </w:abstractNum>
-  <w:abstractNum w:abstractNumId="13" w15:restartNumberingAfterBreak="0">
+  <w:abstractNum w:abstractNumId="14" w15:restartNumberingAfterBreak="0">
     <w:nsid w:val="5C9A3AFF"/>
     <w:multiLevelType w:val="hybridMultilevel"/>
     <w:tmpl w:val="2A544AB2"/>
@@ -3104,7 +4075,7 @@
       </w:rPr>
     </w:lvl>
   </w:abstractNum>
-  <w:abstractNum w:abstractNumId="14" w15:restartNumberingAfterBreak="0">
+  <w:abstractNum w:abstractNumId="15" w15:restartNumberingAfterBreak="0">
     <w:nsid w:val="62FE077A"/>
     <w:multiLevelType w:val="hybridMultilevel"/>
     <w:tmpl w:val="163EC88C"/>
@@ -3217,7 +4188,7 @@
       </w:rPr>
     </w:lvl>
   </w:abstractNum>
-  <w:abstractNum w:abstractNumId="15" w15:restartNumberingAfterBreak="0">
+  <w:abstractNum w:abstractNumId="16" w15:restartNumberingAfterBreak="0">
     <w:nsid w:val="63224845"/>
     <w:multiLevelType w:val="hybridMultilevel"/>
     <w:tmpl w:val="641E3526"/>
@@ -3330,7 +4301,7 @@
       </w:rPr>
     </w:lvl>
   </w:abstractNum>
-  <w:abstractNum w:abstractNumId="16" w15:restartNumberingAfterBreak="0">
+  <w:abstractNum w:abstractNumId="17" w15:restartNumberingAfterBreak="0">
     <w:nsid w:val="6A406974"/>
     <w:multiLevelType w:val="hybridMultilevel"/>
     <w:tmpl w:val="870083EA"/>
@@ -3443,7 +4414,7 @@
       </w:rPr>
     </w:lvl>
   </w:abstractNum>
-  <w:abstractNum w:abstractNumId="17" w15:restartNumberingAfterBreak="0">
+  <w:abstractNum w:abstractNumId="18" w15:restartNumberingAfterBreak="0">
     <w:nsid w:val="6ABF7E24"/>
     <w:multiLevelType w:val="multilevel"/>
     <w:tmpl w:val="DD95C313"/>
@@ -3592,7 +4563,7 @@
       </w:rPr>
     </w:lvl>
   </w:abstractNum>
-  <w:abstractNum w:abstractNumId="18" w15:restartNumberingAfterBreak="0">
+  <w:abstractNum w:abstractNumId="19" w15:restartNumberingAfterBreak="0">
     <w:nsid w:val="753E24D2"/>
     <w:multiLevelType w:val="hybridMultilevel"/>
     <w:tmpl w:val="75584792"/>
@@ -3705,7 +4676,7 @@
       </w:rPr>
     </w:lvl>
   </w:abstractNum>
-  <w:abstractNum w:abstractNumId="19" w15:restartNumberingAfterBreak="0">
+  <w:abstractNum w:abstractNumId="20" w15:restartNumberingAfterBreak="0">
     <w:nsid w:val="7EFECB80"/>
     <w:multiLevelType w:val="multilevel"/>
     <w:tmpl w:val="7EFECB80"/>
@@ -3873,25 +4844,25 @@
     <w:abstractNumId w:val="2"/>
   </w:num>
   <w:num w:numId="7" w16cid:durableId="1322537623">
-    <w:abstractNumId w:val="19"/>
+    <w:abstractNumId w:val="20"/>
   </w:num>
   <w:num w:numId="8" w16cid:durableId="1399785669">
     <w:abstractNumId w:val="6"/>
   </w:num>
   <w:num w:numId="9" w16cid:durableId="120543166">
-    <w:abstractNumId w:val="16"/>
+    <w:abstractNumId w:val="17"/>
   </w:num>
   <w:num w:numId="10" w16cid:durableId="589511976">
-    <w:abstractNumId w:val="18"/>
+    <w:abstractNumId w:val="19"/>
   </w:num>
   <w:num w:numId="11" w16cid:durableId="1301379947">
     <w:abstractNumId w:val="8"/>
   </w:num>
   <w:num w:numId="12" w16cid:durableId="793449175">
-    <w:abstractNumId w:val="14"/>
+    <w:abstractNumId w:val="15"/>
   </w:num>
   <w:num w:numId="13" w16cid:durableId="1667828648">
-    <w:abstractNumId w:val="13"/>
+    <w:abstractNumId w:val="14"/>
   </w:num>
   <w:num w:numId="14" w16cid:durableId="187378037">
     <w:abstractNumId w:val="10"/>
@@ -3900,19 +4871,22 @@
     <w:abstractNumId w:val="9"/>
   </w:num>
   <w:num w:numId="16" w16cid:durableId="1222788068">
-    <w:abstractNumId w:val="11"/>
+    <w:abstractNumId w:val="12"/>
   </w:num>
   <w:num w:numId="17" w16cid:durableId="1384871919">
-    <w:abstractNumId w:val="12"/>
+    <w:abstractNumId w:val="13"/>
   </w:num>
   <w:num w:numId="18" w16cid:durableId="1781875696">
     <w:abstractNumId w:val="7"/>
   </w:num>
   <w:num w:numId="19" w16cid:durableId="2101442116">
-    <w:abstractNumId w:val="15"/>
+    <w:abstractNumId w:val="16"/>
   </w:num>
   <w:num w:numId="20" w16cid:durableId="2129616027">
-    <w:abstractNumId w:val="17"/>
+    <w:abstractNumId w:val="18"/>
+  </w:num>
+  <w:num w:numId="21" w16cid:durableId="1762140987">
+    <w:abstractNumId w:val="11"/>
   </w:num>
 </w:numbering>
 </file>

</xml_diff>

<commit_message>
UML diagram added and git SS added in report
</commit_message>
<xml_diff>
--- a/Project Report.docx
+++ b/Project Report.docx
@@ -3234,10 +3234,19 @@
     </w:p>
     <w:p>
       <w:pPr>
-        <w:spacing w:line="23" w:lineRule="atLeast"/>
-        <w:rPr>
-          <w:rFonts w:asciiTheme="majorBidi" w:eastAsia="sans-serif" w:hAnsiTheme="majorBidi" w:cstheme="majorBidi"/>
-          <w:color w:val="808080"/>
+        <w:pStyle w:val="Heading2"/>
+        <w:keepNext w:val="0"/>
+        <w:keepLines w:val="0"/>
+        <w:pBdr>
+          <w:top w:val="none" w:sz="0" w:space="0" w:color="1F1F1F"/>
+          <w:left w:val="none" w:sz="0" w:space="0" w:color="1F1F1F"/>
+          <w:bottom w:val="none" w:sz="0" w:space="0" w:color="1F1F1F"/>
+          <w:right w:val="none" w:sz="0" w:space="0" w:color="1F1F1F"/>
+        </w:pBdr>
+        <w:spacing w:before="0" w:after="160" w:line="23" w:lineRule="atLeast"/>
+        <w:rPr>
+          <w:rFonts w:asciiTheme="majorBidi" w:eastAsia="sans-serif" w:hAnsiTheme="majorBidi"/>
+          <w:color w:val="1F1F1F"/>
         </w:rPr>
       </w:pPr>
       <w:r>
@@ -3349,6 +3358,874 @@
         </w:rPr>
         <w:t xml:space="preserve"> method are now more organized, which is better, for the domain classes and the main method.</w:t>
       </w:r>
+      <w:r>
+        <w:rPr>
+          <w:rFonts w:ascii="Segoe UI" w:hAnsi="Segoe UI" w:cs="Segoe UI"/>
+          <w:color w:val="2B2D38"/>
+          <w:sz w:val="23"/>
+          <w:szCs w:val="23"/>
+          <w:shd w:val="clear" w:color="auto" w:fill="FFFFFF"/>
+        </w:rPr>
+        <w:br/>
+      </w:r>
+      <w:r>
+        <w:rPr>
+          <w:rFonts w:ascii="Segoe UI" w:hAnsi="Segoe UI" w:cs="Segoe UI"/>
+          <w:color w:val="2B2D38"/>
+          <w:sz w:val="23"/>
+          <w:szCs w:val="23"/>
+          <w:shd w:val="clear" w:color="auto" w:fill="FFFFFF"/>
+        </w:rPr>
+        <w:br/>
+      </w:r>
+      <w:r>
+        <w:rPr>
+          <w:rFonts w:asciiTheme="majorBidi" w:eastAsia="sans-serif" w:hAnsiTheme="majorBidi"/>
+          <w:b/>
+          <w:bCs/>
+          <w:color w:val="1F1F1F"/>
+          <w:bdr w:val="none" w:sz="0" w:space="0" w:color="1F1F1F"/>
+        </w:rPr>
+        <w:t>6. JUnit Testing Strategy</w:t>
+      </w:r>
+    </w:p>
+    <w:p>
+      <w:pPr>
+        <w:pStyle w:val="NormalWeb"/>
+        <w:pBdr>
+          <w:top w:val="none" w:sz="0" w:space="0" w:color="1F1F1F"/>
+          <w:left w:val="none" w:sz="0" w:space="0" w:color="1F1F1F"/>
+          <w:bottom w:val="none" w:sz="0" w:space="0" w:color="1F1F1F"/>
+          <w:right w:val="none" w:sz="0" w:space="0" w:color="1F1F1F"/>
+        </w:pBdr>
+        <w:spacing w:beforeAutospacing="0" w:after="200" w:afterAutospacing="0" w:line="23" w:lineRule="atLeast"/>
+        <w:rPr>
+          <w:rFonts w:asciiTheme="majorBidi" w:eastAsia="sans-serif" w:hAnsiTheme="majorBidi" w:cstheme="majorBidi"/>
+          <w:color w:val="1F1F1F"/>
+        </w:rPr>
+      </w:pPr>
+      <w:r>
+        <w:rPr>
+          <w:rFonts w:asciiTheme="majorBidi" w:eastAsia="sans-serif" w:hAnsiTheme="majorBidi" w:cstheme="majorBidi"/>
+          <w:color w:val="1F1F1F"/>
+        </w:rPr>
+        <w:t>Testing was conducted to ensure the core business rules are unbreakable. Five key scenarios were tested:</w:t>
+      </w:r>
+    </w:p>
+    <w:p>
+      <w:pPr>
+        <w:pStyle w:val="ListParagraph"/>
+        <w:numPr>
+          <w:ilvl w:val="0"/>
+          <w:numId w:val="1"/>
+        </w:numPr>
+        <w:spacing w:before="100" w:beforeAutospacing="1" w:after="100" w:afterAutospacing="1" w:line="240" w:lineRule="auto"/>
+        <w:rPr>
+          <w:rFonts w:asciiTheme="majorBidi" w:eastAsia="Times New Roman" w:hAnsiTheme="majorBidi" w:cstheme="majorBidi"/>
+          <w:kern w:val="0"/>
+          <w:lang w:eastAsia="en-GB"/>
+          <w14:ligatures w14:val="none"/>
+        </w:rPr>
+      </w:pPr>
+      <w:r>
+        <w:rPr>
+          <w:rFonts w:asciiTheme="majorBidi" w:eastAsia="Times New Roman" w:hAnsiTheme="majorBidi" w:cstheme="majorBidi"/>
+          <w:b/>
+          <w:bCs/>
+          <w:kern w:val="0"/>
+          <w:lang w:eastAsia="en-GB"/>
+          <w14:ligatures w14:val="none"/>
+        </w:rPr>
+        <w:t>Full Lesson Scenario</w:t>
+      </w:r>
+      <w:r>
+        <w:rPr>
+          <w:rFonts w:asciiTheme="majorBidi" w:eastAsia="Times New Roman" w:hAnsiTheme="majorBidi" w:cstheme="majorBidi"/>
+          <w:kern w:val="0"/>
+          <w:lang w:eastAsia="en-GB"/>
+          <w14:ligatures w14:val="none"/>
+        </w:rPr>
+        <w:t>: Mocking 4 bookings and verifying the 5th is rejected.</w:t>
+      </w:r>
+    </w:p>
+    <w:p>
+      <w:pPr>
+        <w:pStyle w:val="ListParagraph"/>
+        <w:numPr>
+          <w:ilvl w:val="0"/>
+          <w:numId w:val="1"/>
+        </w:numPr>
+        <w:spacing w:before="100" w:beforeAutospacing="1" w:after="100" w:afterAutospacing="1" w:line="240" w:lineRule="auto"/>
+        <w:rPr>
+          <w:rFonts w:asciiTheme="majorBidi" w:eastAsia="Times New Roman" w:hAnsiTheme="majorBidi" w:cstheme="majorBidi"/>
+          <w:kern w:val="0"/>
+          <w:lang w:eastAsia="en-GB"/>
+          <w14:ligatures w14:val="none"/>
+        </w:rPr>
+      </w:pPr>
+      <w:r>
+        <w:rPr>
+          <w:rFonts w:asciiTheme="majorBidi" w:eastAsia="Times New Roman" w:hAnsiTheme="majorBidi" w:cstheme="majorBidi"/>
+          <w:b/>
+          <w:bCs/>
+          <w:kern w:val="0"/>
+          <w:lang w:eastAsia="en-GB"/>
+          <w14:ligatures w14:val="none"/>
+        </w:rPr>
+        <w:t>Duplicate Entry</w:t>
+      </w:r>
+      <w:r>
+        <w:rPr>
+          <w:rFonts w:asciiTheme="majorBidi" w:eastAsia="Times New Roman" w:hAnsiTheme="majorBidi" w:cstheme="majorBidi"/>
+          <w:kern w:val="0"/>
+          <w:lang w:eastAsia="en-GB"/>
+          <w14:ligatures w14:val="none"/>
+        </w:rPr>
+        <w:t>: Attempting to book a member into the same lesson twice.</w:t>
+      </w:r>
+    </w:p>
+    <w:p>
+      <w:pPr>
+        <w:pStyle w:val="ListParagraph"/>
+        <w:numPr>
+          <w:ilvl w:val="0"/>
+          <w:numId w:val="1"/>
+        </w:numPr>
+        <w:spacing w:before="100" w:beforeAutospacing="1" w:after="100" w:afterAutospacing="1" w:line="240" w:lineRule="auto"/>
+        <w:rPr>
+          <w:rFonts w:asciiTheme="majorBidi" w:eastAsia="Times New Roman" w:hAnsiTheme="majorBidi" w:cstheme="majorBidi"/>
+          <w:kern w:val="0"/>
+          <w:lang w:eastAsia="en-GB"/>
+          <w14:ligatures w14:val="none"/>
+        </w:rPr>
+      </w:pPr>
+      <w:r>
+        <w:rPr>
+          <w:rFonts w:asciiTheme="majorBidi" w:eastAsia="Times New Roman" w:hAnsiTheme="majorBidi" w:cstheme="majorBidi"/>
+          <w:b/>
+          <w:bCs/>
+          <w:kern w:val="0"/>
+          <w:lang w:eastAsia="en-GB"/>
+          <w14:ligatures w14:val="none"/>
+        </w:rPr>
+        <w:t>Boundary Rating</w:t>
+      </w:r>
+      <w:r>
+        <w:rPr>
+          <w:rFonts w:asciiTheme="majorBidi" w:eastAsia="Times New Roman" w:hAnsiTheme="majorBidi" w:cstheme="majorBidi"/>
+          <w:kern w:val="0"/>
+          <w:lang w:eastAsia="en-GB"/>
+          <w14:ligatures w14:val="none"/>
+        </w:rPr>
+        <w:t>: Testing that the system rejects a rating of 6.</w:t>
+      </w:r>
+    </w:p>
+    <w:p>
+      <w:pPr>
+        <w:pStyle w:val="ListParagraph"/>
+        <w:numPr>
+          <w:ilvl w:val="0"/>
+          <w:numId w:val="1"/>
+        </w:numPr>
+        <w:spacing w:before="100" w:beforeAutospacing="1" w:after="100" w:afterAutospacing="1" w:line="240" w:lineRule="auto"/>
+        <w:rPr>
+          <w:rFonts w:asciiTheme="majorBidi" w:eastAsia="Times New Roman" w:hAnsiTheme="majorBidi" w:cstheme="majorBidi"/>
+          <w:kern w:val="0"/>
+          <w:lang w:eastAsia="en-GB"/>
+          <w14:ligatures w14:val="none"/>
+        </w:rPr>
+      </w:pPr>
+      <w:r>
+        <w:rPr>
+          <w:rFonts w:asciiTheme="majorBidi" w:eastAsia="Times New Roman" w:hAnsiTheme="majorBidi" w:cstheme="majorBidi"/>
+          <w:b/>
+          <w:bCs/>
+          <w:kern w:val="0"/>
+          <w:lang w:eastAsia="en-GB"/>
+          <w14:ligatures w14:val="none"/>
+        </w:rPr>
+        <w:t>Cancellation Logic</w:t>
+      </w:r>
+      <w:r>
+        <w:rPr>
+          <w:rFonts w:asciiTheme="majorBidi" w:eastAsia="Times New Roman" w:hAnsiTheme="majorBidi" w:cstheme="majorBidi"/>
+          <w:kern w:val="0"/>
+          <w:lang w:eastAsia="en-GB"/>
+          <w14:ligatures w14:val="none"/>
+        </w:rPr>
+        <w:t>: Verifying that a cancelled booking successfully increments the available capacity of a lesson.</w:t>
+      </w:r>
+    </w:p>
+    <w:p>
+      <w:pPr>
+        <w:pStyle w:val="ListParagraph"/>
+        <w:numPr>
+          <w:ilvl w:val="0"/>
+          <w:numId w:val="1"/>
+        </w:numPr>
+        <w:spacing w:before="100" w:beforeAutospacing="1" w:after="100" w:afterAutospacing="1" w:line="240" w:lineRule="auto"/>
+        <w:rPr>
+          <w:rFonts w:asciiTheme="majorBidi" w:eastAsia="Times New Roman" w:hAnsiTheme="majorBidi" w:cstheme="majorBidi"/>
+          <w:kern w:val="0"/>
+          <w:lang w:eastAsia="en-GB"/>
+          <w14:ligatures w14:val="none"/>
+        </w:rPr>
+      </w:pPr>
+      <w:r>
+        <w:rPr>
+          <w:rFonts w:asciiTheme="majorBidi" w:eastAsia="Times New Roman" w:hAnsiTheme="majorBidi" w:cstheme="majorBidi"/>
+          <w:b/>
+          <w:bCs/>
+          <w:kern w:val="0"/>
+          <w:lang w:eastAsia="en-GB"/>
+          <w14:ligatures w14:val="none"/>
+        </w:rPr>
+        <w:t>Income Math</w:t>
+      </w:r>
+      <w:r>
+        <w:rPr>
+          <w:rFonts w:asciiTheme="majorBidi" w:eastAsia="Times New Roman" w:hAnsiTheme="majorBidi" w:cstheme="majorBidi"/>
+          <w:kern w:val="0"/>
+          <w:lang w:eastAsia="en-GB"/>
+          <w14:ligatures w14:val="none"/>
+        </w:rPr>
+        <w:t>: Manually calculating a small batch of bookings to ensure the Champion Report's math logic matches the expected financial output.</w:t>
+      </w:r>
+    </w:p>
+    <w:p>
+      <w:pPr>
+        <w:pStyle w:val="Heading2"/>
+        <w:keepNext w:val="0"/>
+        <w:keepLines w:val="0"/>
+        <w:pBdr>
+          <w:top w:val="none" w:sz="0" w:space="0" w:color="1F1F1F"/>
+          <w:left w:val="none" w:sz="0" w:space="0" w:color="1F1F1F"/>
+          <w:bottom w:val="none" w:sz="0" w:space="0" w:color="1F1F1F"/>
+          <w:right w:val="none" w:sz="0" w:space="0" w:color="1F1F1F"/>
+        </w:pBdr>
+        <w:spacing w:before="0" w:after="160" w:line="23" w:lineRule="atLeast"/>
+        <w:rPr>
+          <w:rFonts w:asciiTheme="majorBidi" w:eastAsia="sans-serif" w:hAnsiTheme="majorBidi"/>
+          <w:color w:val="1F1F1F"/>
+        </w:rPr>
+      </w:pPr>
+      <w:r>
+        <w:rPr>
+          <w:rFonts w:asciiTheme="majorBidi" w:eastAsia="sans-serif" w:hAnsiTheme="majorBidi"/>
+          <w:b/>
+          <w:bCs/>
+          <w:color w:val="1F1F1F"/>
+          <w:bdr w:val="none" w:sz="0" w:space="0" w:color="1F1F1F"/>
+        </w:rPr>
+        <w:t>7. Assumptions</w:t>
+      </w:r>
+    </w:p>
+    <w:p>
+      <w:pPr>
+        <w:pStyle w:val="ListParagraph"/>
+        <w:numPr>
+          <w:ilvl w:val="0"/>
+          <w:numId w:val="1"/>
+        </w:numPr>
+        <w:spacing w:before="100" w:beforeAutospacing="1" w:after="100" w:afterAutospacing="1" w:line="240" w:lineRule="auto"/>
+        <w:rPr>
+          <w:rFonts w:asciiTheme="majorBidi" w:eastAsia="Times New Roman" w:hAnsiTheme="majorBidi" w:cstheme="majorBidi"/>
+          <w:kern w:val="0"/>
+          <w:lang w:eastAsia="en-GB"/>
+          <w14:ligatures w14:val="none"/>
+        </w:rPr>
+      </w:pPr>
+      <w:r>
+        <w:rPr>
+          <w:rFonts w:asciiTheme="majorBidi" w:eastAsia="Times New Roman" w:hAnsiTheme="majorBidi" w:cstheme="majorBidi"/>
+          <w:b/>
+          <w:bCs/>
+          <w:kern w:val="0"/>
+          <w:lang w:eastAsia="en-GB"/>
+          <w14:ligatures w14:val="none"/>
+        </w:rPr>
+        <w:t>No Persistence</w:t>
+      </w:r>
+      <w:r>
+        <w:rPr>
+          <w:rFonts w:asciiTheme="majorBidi" w:eastAsia="Times New Roman" w:hAnsiTheme="majorBidi" w:cstheme="majorBidi"/>
+          <w:kern w:val="0"/>
+          <w:lang w:eastAsia="en-GB"/>
+          <w14:ligatures w14:val="none"/>
+        </w:rPr>
+        <w:t>: It is assumed the system starts fresh every time it is opened.</w:t>
+      </w:r>
+    </w:p>
+    <w:p>
+      <w:pPr>
+        <w:pStyle w:val="ListParagraph"/>
+        <w:numPr>
+          <w:ilvl w:val="0"/>
+          <w:numId w:val="1"/>
+        </w:numPr>
+        <w:spacing w:before="100" w:beforeAutospacing="1" w:after="100" w:afterAutospacing="1" w:line="240" w:lineRule="auto"/>
+        <w:rPr>
+          <w:rFonts w:asciiTheme="majorBidi" w:eastAsia="Times New Roman" w:hAnsiTheme="majorBidi" w:cstheme="majorBidi"/>
+          <w:kern w:val="0"/>
+          <w:lang w:eastAsia="en-GB"/>
+          <w14:ligatures w14:val="none"/>
+        </w:rPr>
+      </w:pPr>
+      <w:r>
+        <w:rPr>
+          <w:rFonts w:asciiTheme="majorBidi" w:eastAsia="Times New Roman" w:hAnsiTheme="majorBidi" w:cstheme="majorBidi"/>
+          <w:b/>
+          <w:bCs/>
+          <w:kern w:val="0"/>
+          <w:lang w:eastAsia="en-GB"/>
+          <w14:ligatures w14:val="none"/>
+        </w:rPr>
+        <w:t>Member ID</w:t>
+      </w:r>
+      <w:r>
+        <w:rPr>
+          <w:rFonts w:asciiTheme="majorBidi" w:eastAsia="Times New Roman" w:hAnsiTheme="majorBidi" w:cstheme="majorBidi"/>
+          <w:kern w:val="0"/>
+          <w:lang w:eastAsia="en-GB"/>
+          <w14:ligatures w14:val="none"/>
+        </w:rPr>
+        <w:t>: It is assumed that members know their ID (M01-M10) to access the booking features.</w:t>
+      </w:r>
+    </w:p>
+    <w:p>
+      <w:pPr>
+        <w:pStyle w:val="ListParagraph"/>
+        <w:numPr>
+          <w:ilvl w:val="0"/>
+          <w:numId w:val="1"/>
+        </w:numPr>
+        <w:spacing w:before="100" w:beforeAutospacing="1" w:after="100" w:afterAutospacing="1" w:line="240" w:lineRule="auto"/>
+        <w:rPr>
+          <w:rFonts w:asciiTheme="majorBidi" w:eastAsia="Times New Roman" w:hAnsiTheme="majorBidi" w:cstheme="majorBidi"/>
+          <w:kern w:val="0"/>
+          <w:lang w:eastAsia="en-GB"/>
+          <w14:ligatures w14:val="none"/>
+        </w:rPr>
+      </w:pPr>
+      <w:r>
+        <w:rPr>
+          <w:rFonts w:asciiTheme="majorBidi" w:eastAsia="Times New Roman" w:hAnsiTheme="majorBidi" w:cstheme="majorBidi"/>
+          <w:b/>
+          <w:bCs/>
+          <w:kern w:val="0"/>
+          <w:lang w:eastAsia="en-GB"/>
+          <w14:ligatures w14:val="none"/>
+        </w:rPr>
+        <w:t>Logical Time</w:t>
+      </w:r>
+      <w:r>
+        <w:rPr>
+          <w:rFonts w:asciiTheme="majorBidi" w:eastAsia="Times New Roman" w:hAnsiTheme="majorBidi" w:cstheme="majorBidi"/>
+          <w:kern w:val="0"/>
+          <w:lang w:eastAsia="en-GB"/>
+          <w14:ligatures w14:val="none"/>
+        </w:rPr>
+        <w:t>: Since "real time" is not required, the system assumes that "Week 1" happens before "Week 2" purely by user selection sequence.</w:t>
+      </w:r>
+    </w:p>
+    <w:p>
+      <w:pPr>
+        <w:pBdr>
+          <w:top w:val="none" w:sz="0" w:space="0" w:color="1F1F1F"/>
+          <w:left w:val="none" w:sz="0" w:space="0" w:color="1F1F1F"/>
+          <w:bottom w:val="none" w:sz="0" w:space="0" w:color="1F1F1F"/>
+          <w:right w:val="none" w:sz="0" w:space="0" w:color="1F1F1F"/>
+        </w:pBdr>
+        <w:spacing w:line="23" w:lineRule="atLeast"/>
+        <w:rPr>
+          <w:rFonts w:asciiTheme="majorBidi" w:eastAsia="sans-serif" w:hAnsiTheme="majorBidi" w:cstheme="majorBidi"/>
+          <w:color w:val="1F1F1F"/>
+        </w:rPr>
+      </w:pPr>
+    </w:p>
+    <w:p>
+      <w:pPr>
+        <w:spacing w:line="23" w:lineRule="atLeast"/>
+        <w:rPr>
+          <w:rFonts w:asciiTheme="majorBidi" w:eastAsia="sans-serif" w:hAnsiTheme="majorBidi" w:cstheme="majorBidi"/>
+          <w:color w:val="808080"/>
+        </w:rPr>
+      </w:pPr>
+    </w:p>
+    <w:p>
+      <w:pPr>
+        <w:pStyle w:val="Heading2"/>
+        <w:keepNext w:val="0"/>
+        <w:keepLines w:val="0"/>
+        <w:pBdr>
+          <w:top w:val="none" w:sz="0" w:space="0" w:color="1F1F1F"/>
+          <w:left w:val="none" w:sz="0" w:space="0" w:color="1F1F1F"/>
+          <w:bottom w:val="none" w:sz="0" w:space="0" w:color="1F1F1F"/>
+          <w:right w:val="none" w:sz="0" w:space="0" w:color="1F1F1F"/>
+        </w:pBdr>
+        <w:spacing w:before="0" w:after="160" w:line="23" w:lineRule="atLeast"/>
+        <w:rPr>
+          <w:rFonts w:asciiTheme="majorBidi" w:eastAsia="sans-serif" w:hAnsiTheme="majorBidi"/>
+          <w:color w:val="1F1F1F"/>
+        </w:rPr>
+      </w:pPr>
+      <w:r>
+        <w:rPr>
+          <w:rFonts w:asciiTheme="majorBidi" w:eastAsia="sans-serif" w:hAnsiTheme="majorBidi"/>
+          <w:b/>
+          <w:bCs/>
+          <w:color w:val="1F1F1F"/>
+          <w:bdr w:val="none" w:sz="0" w:space="0" w:color="1F1F1F"/>
+        </w:rPr>
+        <w:t>8. UML Class Diagram</w:t>
+      </w:r>
+      <w:r>
+        <w:rPr>
+          <w:rFonts w:asciiTheme="majorBidi" w:eastAsia="sans-serif" w:hAnsiTheme="majorBidi"/>
+          <w:b/>
+          <w:bCs/>
+          <w:color w:val="1F1F1F"/>
+          <w:bdr w:val="none" w:sz="0" w:space="0" w:color="1F1F1F"/>
+        </w:rPr>
+        <w:br/>
+      </w:r>
+    </w:p>
+    <w:p>
+      <w:pPr>
+        <w:spacing w:line="23" w:lineRule="atLeast"/>
+        <w:rPr>
+          <w:rFonts w:asciiTheme="majorBidi" w:eastAsia="sans-serif" w:hAnsiTheme="majorBidi" w:cstheme="majorBidi"/>
+          <w:color w:val="808080"/>
+        </w:rPr>
+      </w:pPr>
+    </w:p>
+    <w:p>
+      <w:pPr>
+        <w:pStyle w:val="Heading2"/>
+        <w:keepNext w:val="0"/>
+        <w:keepLines w:val="0"/>
+        <w:pBdr>
+          <w:top w:val="none" w:sz="0" w:space="0" w:color="1F1F1F"/>
+          <w:left w:val="none" w:sz="0" w:space="0" w:color="1F1F1F"/>
+          <w:bottom w:val="none" w:sz="0" w:space="0" w:color="1F1F1F"/>
+          <w:right w:val="none" w:sz="0" w:space="0" w:color="1F1F1F"/>
+        </w:pBdr>
+        <w:spacing w:before="0" w:after="160" w:line="23" w:lineRule="atLeast"/>
+        <w:rPr>
+          <w:rFonts w:asciiTheme="majorBidi" w:eastAsia="sans-serif" w:hAnsiTheme="majorBidi"/>
+          <w:color w:val="1F1F1F"/>
+        </w:rPr>
+      </w:pPr>
+      <w:r>
+        <w:rPr>
+          <w:rFonts w:asciiTheme="majorBidi" w:eastAsia="sans-serif" w:hAnsiTheme="majorBidi"/>
+          <w:b/>
+          <w:bCs/>
+          <w:color w:val="1F1F1F"/>
+          <w:bdr w:val="none" w:sz="0" w:space="0" w:color="1F1F1F"/>
+        </w:rPr>
+        <w:t>9. Version Control (Git) Snapshots</w:t>
+      </w:r>
+    </w:p>
+    <w:p>
+      <w:pPr>
+        <w:pStyle w:val="NormalWeb"/>
+        <w:pBdr>
+          <w:top w:val="none" w:sz="0" w:space="0" w:color="1F1F1F"/>
+          <w:left w:val="none" w:sz="0" w:space="0" w:color="1F1F1F"/>
+          <w:bottom w:val="none" w:sz="0" w:space="0" w:color="1F1F1F"/>
+          <w:right w:val="none" w:sz="0" w:space="0" w:color="1F1F1F"/>
+        </w:pBdr>
+        <w:spacing w:beforeAutospacing="0" w:after="200" w:afterAutospacing="0" w:line="23" w:lineRule="atLeast"/>
+        <w:rPr>
+          <w:rFonts w:asciiTheme="majorBidi" w:eastAsia="sans-serif" w:hAnsiTheme="majorBidi" w:cstheme="majorBidi"/>
+          <w:color w:val="1F1F1F"/>
+          <w:bdr w:val="none" w:sz="0" w:space="0" w:color="1F1F1F"/>
+        </w:rPr>
+      </w:pPr>
+      <w:r>
+        <w:rPr>
+          <w:rFonts w:asciiTheme="majorBidi" w:eastAsia="sans-serif" w:hAnsiTheme="majorBidi" w:cstheme="majorBidi"/>
+          <w:color w:val="1F1F1F"/>
+          <w:bdr w:val="none" w:sz="0" w:space="0" w:color="1F1F1F"/>
+        </w:rPr>
+        <w:t>(Note: Please insert screenshots of your Git commit history here to show the progression of your code from initialization to final testing.</w:t>
+      </w:r>
+    </w:p>
+    <w:p>
+      <w:pPr>
+        <w:pStyle w:val="NormalWeb"/>
+        <w:pBdr>
+          <w:top w:val="none" w:sz="0" w:space="0" w:color="1F1F1F"/>
+          <w:left w:val="none" w:sz="0" w:space="0" w:color="1F1F1F"/>
+          <w:bottom w:val="none" w:sz="0" w:space="0" w:color="1F1F1F"/>
+          <w:right w:val="none" w:sz="0" w:space="0" w:color="1F1F1F"/>
+        </w:pBdr>
+        <w:tabs>
+          <w:tab w:val="left" w:pos="1533"/>
+        </w:tabs>
+        <w:spacing w:beforeAutospacing="0" w:after="200" w:afterAutospacing="0" w:line="23" w:lineRule="atLeast"/>
+        <w:rPr>
+          <w:rFonts w:asciiTheme="majorBidi" w:eastAsia="sans-serif" w:hAnsiTheme="majorBidi" w:cstheme="majorBidi"/>
+          <w:color w:val="1F1F1F"/>
+          <w:bdr w:val="none" w:sz="0" w:space="0" w:color="1F1F1F"/>
+        </w:rPr>
+      </w:pPr>
+      <w:r>
+        <w:rPr>
+          <w:rFonts w:asciiTheme="majorBidi" w:eastAsia="sans-serif" w:hAnsiTheme="majorBidi" w:cstheme="majorBidi"/>
+          <w:color w:val="1F1F1F"/>
+          <w:bdr w:val="none" w:sz="0" w:space="0" w:color="1F1F1F"/>
+        </w:rPr>
+        <w:tab/>
+      </w:r>
+    </w:p>
+    <w:p>
+      <w:pPr>
+        <w:pStyle w:val="NormalWeb"/>
+        <w:shd w:val="clear" w:color="auto" w:fill="FFFFFF"/>
+        <w:rPr>
+          <w:rFonts w:ascii="Segoe UI" w:eastAsia="Times New Roman" w:hAnsi="Segoe UI" w:cs="Segoe UI"/>
+          <w:color w:val="2B2D38"/>
+          <w:sz w:val="23"/>
+          <w:szCs w:val="23"/>
+          <w:lang w:val="en-GB" w:eastAsia="en-GB"/>
+        </w:rPr>
+      </w:pPr>
+      <w:proofErr w:type="gramStart"/>
+      <w:r>
+        <w:rPr>
+          <w:rFonts w:asciiTheme="majorBidi" w:eastAsia="sans-serif" w:hAnsiTheme="majorBidi" w:cstheme="majorBidi"/>
+          <w:color w:val="1F1F1F"/>
+          <w:bdr w:val="none" w:sz="0" w:space="0" w:color="1F1F1F"/>
+        </w:rPr>
+        <w:t>Conclusion :</w:t>
+      </w:r>
+      <w:proofErr w:type="gramEnd"/>
+      <w:r>
+        <w:rPr>
+          <w:rFonts w:asciiTheme="majorBidi" w:eastAsia="sans-serif" w:hAnsiTheme="majorBidi" w:cstheme="majorBidi"/>
+          <w:color w:val="1F1F1F"/>
+          <w:bdr w:val="none" w:sz="0" w:space="0" w:color="1F1F1F"/>
+        </w:rPr>
+        <w:br/>
+      </w:r>
+      <w:r>
+        <w:rPr>
+          <w:rFonts w:asciiTheme="majorBidi" w:eastAsia="sans-serif" w:hAnsiTheme="majorBidi" w:cstheme="majorBidi"/>
+          <w:color w:val="1F1F1F"/>
+          <w:bdr w:val="none" w:sz="0" w:space="0" w:color="1F1F1F"/>
+        </w:rPr>
+        <w:br/>
+      </w:r>
+      <w:r>
+        <w:rPr>
+          <w:rFonts w:ascii="Segoe UI" w:eastAsia="Times New Roman" w:hAnsi="Segoe UI" w:cs="Segoe UI"/>
+          <w:color w:val="2B2D38"/>
+          <w:sz w:val="23"/>
+          <w:szCs w:val="23"/>
+          <w:lang w:val="en-GB" w:eastAsia="en-GB"/>
+        </w:rPr>
+        <w:t xml:space="preserve">the </w:t>
+      </w:r>
+      <w:proofErr w:type="spellStart"/>
+      <w:r>
+        <w:rPr>
+          <w:rFonts w:ascii="Segoe UI" w:eastAsia="Times New Roman" w:hAnsi="Segoe UI" w:cs="Segoe UI"/>
+          <w:color w:val="2B2D38"/>
+          <w:sz w:val="23"/>
+          <w:szCs w:val="23"/>
+          <w:lang w:val="en-GB" w:eastAsia="en-GB"/>
+        </w:rPr>
+        <w:t>Furzefield</w:t>
+      </w:r>
+      <w:proofErr w:type="spellEnd"/>
+      <w:r>
+        <w:rPr>
+          <w:rFonts w:ascii="Segoe UI" w:eastAsia="Times New Roman" w:hAnsi="Segoe UI" w:cs="Segoe UI"/>
+          <w:color w:val="2B2D38"/>
+          <w:sz w:val="23"/>
+          <w:szCs w:val="23"/>
+          <w:lang w:val="en-GB" w:eastAsia="en-GB"/>
+        </w:rPr>
+        <w:t xml:space="preserve"> Leisure Centre Booking System is a software solution. It helps manage gym bookings from start, to finish. This includes finding out about a gym session booking it attending it and then reviewing it. The system follows all the rules of the leisure centre.</w:t>
+      </w:r>
+    </w:p>
+    <w:p>
+      <w:pPr>
+        <w:shd w:val="clear" w:color="auto" w:fill="FFFFFF"/>
+        <w:spacing w:before="150" w:after="100" w:afterAutospacing="1" w:line="240" w:lineRule="auto"/>
+        <w:rPr>
+          <w:rFonts w:ascii="Segoe UI" w:eastAsia="Times New Roman" w:hAnsi="Segoe UI" w:cs="Segoe UI"/>
+          <w:color w:val="2B2D38"/>
+          <w:kern w:val="0"/>
+          <w:sz w:val="23"/>
+          <w:szCs w:val="23"/>
+          <w:lang w:eastAsia="en-GB"/>
+          <w14:ligatures w14:val="none"/>
+        </w:rPr>
+      </w:pPr>
+    </w:p>
+    <w:p>
+      <w:pPr>
+        <w:shd w:val="clear" w:color="auto" w:fill="FFFFFF"/>
+        <w:spacing w:before="150" w:after="100" w:afterAutospacing="1" w:line="240" w:lineRule="auto"/>
+        <w:rPr>
+          <w:rFonts w:ascii="Segoe UI" w:eastAsia="Times New Roman" w:hAnsi="Segoe UI" w:cs="Segoe UI"/>
+          <w:color w:val="2B2D38"/>
+          <w:kern w:val="0"/>
+          <w:sz w:val="23"/>
+          <w:szCs w:val="23"/>
+          <w:lang w:eastAsia="en-GB"/>
+          <w14:ligatures w14:val="none"/>
+        </w:rPr>
+      </w:pPr>
+      <w:r>
+        <w:rPr>
+          <w:rFonts w:ascii="Segoe UI" w:eastAsia="Times New Roman" w:hAnsi="Segoe UI" w:cs="Segoe UI"/>
+          <w:color w:val="2B2D38"/>
+          <w:kern w:val="0"/>
+          <w:sz w:val="23"/>
+          <w:szCs w:val="23"/>
+          <w:lang w:eastAsia="en-GB"/>
+          <w14:ligatures w14:val="none"/>
+        </w:rPr>
+        <w:lastRenderedPageBreak/>
+        <w:t>The project achieved some things:</w:t>
+      </w:r>
+    </w:p>
+    <w:p>
+      <w:pPr>
+        <w:shd w:val="clear" w:color="auto" w:fill="FFFFFF"/>
+        <w:spacing w:before="150" w:after="100" w:afterAutospacing="1" w:line="240" w:lineRule="auto"/>
+        <w:rPr>
+          <w:rFonts w:ascii="Segoe UI" w:eastAsia="Times New Roman" w:hAnsi="Segoe UI" w:cs="Segoe UI"/>
+          <w:color w:val="2B2D38"/>
+          <w:kern w:val="0"/>
+          <w:sz w:val="23"/>
+          <w:szCs w:val="23"/>
+          <w:lang w:eastAsia="en-GB"/>
+          <w14:ligatures w14:val="none"/>
+        </w:rPr>
+      </w:pPr>
+      <w:r>
+        <w:rPr>
+          <w:rFonts w:ascii="Segoe UI" w:eastAsia="Times New Roman" w:hAnsi="Segoe UI" w:cs="Segoe UI"/>
+          <w:color w:val="2B2D38"/>
+          <w:kern w:val="0"/>
+          <w:sz w:val="23"/>
+          <w:szCs w:val="23"/>
+          <w:lang w:eastAsia="en-GB"/>
+          <w14:ligatures w14:val="none"/>
+        </w:rPr>
+        <w:t>It was designed to be strong. It uses design principles to keep data safe across many lessons and member profiles. It does not need a database.</w:t>
+      </w:r>
+    </w:p>
+    <w:p>
+      <w:pPr>
+        <w:pStyle w:val="ListParagraph"/>
+        <w:numPr>
+          <w:ilvl w:val="0"/>
+          <w:numId w:val="15"/>
+        </w:numPr>
+        <w:shd w:val="clear" w:color="auto" w:fill="FFFFFF"/>
+        <w:spacing w:before="150" w:after="100" w:afterAutospacing="1" w:line="240" w:lineRule="auto"/>
+        <w:rPr>
+          <w:rFonts w:ascii="Segoe UI" w:eastAsia="Times New Roman" w:hAnsi="Segoe UI" w:cs="Segoe UI"/>
+          <w:color w:val="2B2D38"/>
+          <w:kern w:val="0"/>
+          <w:sz w:val="23"/>
+          <w:szCs w:val="23"/>
+          <w:lang w:eastAsia="en-GB"/>
+          <w14:ligatures w14:val="none"/>
+        </w:rPr>
+      </w:pPr>
+      <w:r>
+        <w:rPr>
+          <w:rFonts w:ascii="Segoe UI" w:eastAsia="Times New Roman" w:hAnsi="Segoe UI" w:cs="Segoe UI"/>
+          <w:color w:val="2B2D38"/>
+          <w:kern w:val="0"/>
+          <w:sz w:val="23"/>
+          <w:szCs w:val="23"/>
+          <w:lang w:eastAsia="en-GB"/>
+          <w14:ligatures w14:val="none"/>
+        </w:rPr>
+        <w:t xml:space="preserve">The system automatically enforces rules. For </w:t>
+      </w:r>
+      <w:proofErr w:type="gramStart"/>
+      <w:r>
+        <w:rPr>
+          <w:rFonts w:ascii="Segoe UI" w:eastAsia="Times New Roman" w:hAnsi="Segoe UI" w:cs="Segoe UI"/>
+          <w:color w:val="2B2D38"/>
+          <w:kern w:val="0"/>
+          <w:sz w:val="23"/>
+          <w:szCs w:val="23"/>
+          <w:lang w:eastAsia="en-GB"/>
+          <w14:ligatures w14:val="none"/>
+        </w:rPr>
+        <w:t>example</w:t>
+      </w:r>
+      <w:proofErr w:type="gramEnd"/>
+      <w:r>
+        <w:rPr>
+          <w:rFonts w:ascii="Segoe UI" w:eastAsia="Times New Roman" w:hAnsi="Segoe UI" w:cs="Segoe UI"/>
+          <w:color w:val="2B2D38"/>
+          <w:kern w:val="0"/>
+          <w:sz w:val="23"/>
+          <w:szCs w:val="23"/>
+          <w:lang w:eastAsia="en-GB"/>
+          <w14:ligatures w14:val="none"/>
+        </w:rPr>
+        <w:t xml:space="preserve"> four people can book a session at a time. It also stops people from booking the session twice. This reduces mistakes.</w:t>
+      </w:r>
+    </w:p>
+    <w:p>
+      <w:pPr>
+        <w:pStyle w:val="ListParagraph"/>
+        <w:numPr>
+          <w:ilvl w:val="0"/>
+          <w:numId w:val="15"/>
+        </w:numPr>
+        <w:shd w:val="clear" w:color="auto" w:fill="FFFFFF"/>
+        <w:spacing w:before="150" w:after="100" w:afterAutospacing="1" w:line="240" w:lineRule="auto"/>
+        <w:rPr>
+          <w:rFonts w:ascii="Segoe UI" w:eastAsia="Times New Roman" w:hAnsi="Segoe UI" w:cs="Segoe UI"/>
+          <w:color w:val="2B2D38"/>
+          <w:kern w:val="0"/>
+          <w:sz w:val="23"/>
+          <w:szCs w:val="23"/>
+          <w:lang w:eastAsia="en-GB"/>
+          <w14:ligatures w14:val="none"/>
+        </w:rPr>
+      </w:pPr>
+      <w:r>
+        <w:rPr>
+          <w:rFonts w:ascii="Segoe UI" w:eastAsia="Times New Roman" w:hAnsi="Segoe UI" w:cs="Segoe UI"/>
+          <w:color w:val="2B2D38"/>
+          <w:kern w:val="0"/>
+          <w:sz w:val="23"/>
+          <w:szCs w:val="23"/>
+          <w:lang w:eastAsia="en-GB"/>
+          <w14:ligatures w14:val="none"/>
+        </w:rPr>
+        <w:t>The system gives information to managers. It turns booking data into reports. These reports cover lessons and champions each month. They help the leisure centre make decisions.</w:t>
+      </w:r>
+    </w:p>
+    <w:p>
+      <w:pPr>
+        <w:pStyle w:val="ListParagraph"/>
+        <w:numPr>
+          <w:ilvl w:val="0"/>
+          <w:numId w:val="15"/>
+        </w:numPr>
+        <w:shd w:val="clear" w:color="auto" w:fill="FFFFFF"/>
+        <w:spacing w:before="150" w:after="100" w:afterAutospacing="1" w:line="240" w:lineRule="auto"/>
+        <w:rPr>
+          <w:rFonts w:ascii="Segoe UI" w:eastAsia="Times New Roman" w:hAnsi="Segoe UI" w:cs="Segoe UI"/>
+          <w:color w:val="2B2D38"/>
+          <w:kern w:val="0"/>
+          <w:sz w:val="23"/>
+          <w:szCs w:val="23"/>
+          <w:lang w:eastAsia="en-GB"/>
+          <w14:ligatures w14:val="none"/>
+        </w:rPr>
+      </w:pPr>
+      <w:r>
+        <w:rPr>
+          <w:rFonts w:ascii="Segoe UI" w:eastAsia="Times New Roman" w:hAnsi="Segoe UI" w:cs="Segoe UI"/>
+          <w:color w:val="2B2D38"/>
+          <w:kern w:val="0"/>
+          <w:sz w:val="23"/>
+          <w:szCs w:val="23"/>
+          <w:lang w:eastAsia="en-GB"/>
+          <w14:ligatures w14:val="none"/>
+        </w:rPr>
+        <w:t>The system was tested thoroughly. It uses a testing tool to ensure it works well. This meets the standards of professional software engineering.</w:t>
+      </w:r>
+    </w:p>
+    <w:p>
+      <w:pPr>
+        <w:pStyle w:val="ListParagraph"/>
+        <w:numPr>
+          <w:ilvl w:val="0"/>
+          <w:numId w:val="15"/>
+        </w:numPr>
+        <w:shd w:val="clear" w:color="auto" w:fill="FFFFFF"/>
+        <w:spacing w:before="150" w:after="100" w:afterAutospacing="1" w:line="240" w:lineRule="auto"/>
+        <w:rPr>
+          <w:rFonts w:ascii="Segoe UI" w:eastAsia="Times New Roman" w:hAnsi="Segoe UI" w:cs="Segoe UI"/>
+          <w:color w:val="2B2D38"/>
+          <w:kern w:val="0"/>
+          <w:sz w:val="23"/>
+          <w:szCs w:val="23"/>
+          <w:lang w:eastAsia="en-GB"/>
+          <w14:ligatures w14:val="none"/>
+        </w:rPr>
+      </w:pPr>
+      <w:r>
+        <w:rPr>
+          <w:rFonts w:ascii="Segoe UI" w:eastAsia="Times New Roman" w:hAnsi="Segoe UI" w:cs="Segoe UI"/>
+          <w:color w:val="2B2D38"/>
+          <w:kern w:val="0"/>
+          <w:sz w:val="23"/>
+          <w:szCs w:val="23"/>
+          <w:lang w:eastAsia="en-GB"/>
+          <w14:ligatures w14:val="none"/>
+        </w:rPr>
+        <w:t xml:space="preserve">The </w:t>
+      </w:r>
+      <w:proofErr w:type="spellStart"/>
+      <w:r>
+        <w:rPr>
+          <w:rFonts w:ascii="Segoe UI" w:eastAsia="Times New Roman" w:hAnsi="Segoe UI" w:cs="Segoe UI"/>
+          <w:color w:val="2B2D38"/>
+          <w:kern w:val="0"/>
+          <w:sz w:val="23"/>
+          <w:szCs w:val="23"/>
+          <w:lang w:eastAsia="en-GB"/>
+          <w14:ligatures w14:val="none"/>
+        </w:rPr>
+        <w:t>Furzefield</w:t>
+      </w:r>
+      <w:proofErr w:type="spellEnd"/>
+      <w:r>
+        <w:rPr>
+          <w:rFonts w:ascii="Segoe UI" w:eastAsia="Times New Roman" w:hAnsi="Segoe UI" w:cs="Segoe UI"/>
+          <w:color w:val="2B2D38"/>
+          <w:kern w:val="0"/>
+          <w:sz w:val="23"/>
+          <w:szCs w:val="23"/>
+          <w:lang w:eastAsia="en-GB"/>
+          <w14:ligatures w14:val="none"/>
+        </w:rPr>
+        <w:t xml:space="preserve"> Leisure Centre Booking System helps the leisure centre run smoothly. It manages bookings. Gives useful information. The system is reliable and safe.</w:t>
+      </w:r>
+    </w:p>
+    <w:p>
+      <w:pPr>
+        <w:pStyle w:val="NormalWeb"/>
+        <w:pBdr>
+          <w:top w:val="none" w:sz="0" w:space="0" w:color="1F1F1F"/>
+          <w:left w:val="none" w:sz="0" w:space="0" w:color="1F1F1F"/>
+          <w:bottom w:val="none" w:sz="0" w:space="0" w:color="1F1F1F"/>
+          <w:right w:val="none" w:sz="0" w:space="0" w:color="1F1F1F"/>
+        </w:pBdr>
+        <w:spacing w:beforeAutospacing="0" w:after="200" w:afterAutospacing="0" w:line="23" w:lineRule="atLeast"/>
+        <w:rPr>
+          <w:rFonts w:asciiTheme="majorBidi" w:eastAsia="sans-serif" w:hAnsiTheme="majorBidi" w:cstheme="majorBidi"/>
+          <w:color w:val="1F1F1F"/>
+          <w:bdr w:val="none" w:sz="0" w:space="0" w:color="1F1F1F"/>
+        </w:rPr>
+      </w:pPr>
+    </w:p>
+    <w:p>
+      <w:pPr>
+        <w:spacing w:line="23" w:lineRule="atLeast"/>
+        <w:rPr>
+          <w:rFonts w:asciiTheme="majorBidi" w:eastAsia="sans-serif" w:hAnsiTheme="majorBidi" w:cstheme="majorBidi"/>
+          <w:color w:val="808080"/>
+        </w:rPr>
+      </w:pPr>
     </w:p>
     <w:p>
       <w:pPr>
@@ -4692,7 +5569,7 @@
   <w:abstractNum w:abstractNumId="9" w15:restartNumberingAfterBreak="0">
     <w:nsid w:val="394663AF"/>
     <w:multiLevelType w:val="hybridMultilevel"/>
-    <w:tmpl w:val="EA50ACFA"/>
+    <w:tmpl w:val="1020D8CE"/>
     <w:lvl w:ilvl="0" w:tplc="08090001">
       <w:start w:val="1"/>
       <w:numFmt w:val="bullet"/>

</xml_diff>

<commit_message>
made changes in report
</commit_message>
<xml_diff>
--- a/Project Report.docx
+++ b/Project Report.docx
@@ -216,6 +216,13 @@
           <w:color w:val="1F1F1F"/>
         </w:rPr>
         <w:t xml:space="preserve"> 24128953</w:t>
+      </w:r>
+      <w:r>
+        <w:rPr>
+          <w:rFonts w:asciiTheme="majorBidi" w:eastAsia="sans-serif" w:hAnsiTheme="majorBidi" w:cstheme="majorBidi"/>
+          <w:color w:val="1F1F1F"/>
+        </w:rPr>
+        <w:t>.</w:t>
       </w:r>
     </w:p>
     <w:p>

</xml_diff>